<commit_message>
Add native EBM baseline and finalize proposal audit
</commit_message>
<xml_diff>
--- a/XDS_Project_Proposal_Submission_Ready.docx
+++ b/XDS_Project_Proposal_Submission_Ready.docx
@@ -408,7 +408,7 @@
         <w:rPr>
           <w:rtl w:val="0"/>
         </w:rPr>
-        <w:t>A fixed, stratified 70/15/15 train/validation/test split supports identical comparisons. Validation-only assessment froze TabICL 2.2.0 with four estimators: ROC-AUC was 0.952, versus 0.945 for logistic regression and XGBoost and 0.923 for a depth-3 tree, establishing comparability rather than superiority while test data remain untouched. The operating policy ranks each evaluation cohort by predicted risk and flags at most the top 20%, with stable row-order tie-breaking, directly representing limited outreach capacity. On validation this yielded 0.507 dropout recall, 1.000 precision and a 0.199 flag rate; capacity, not an unattainable recall target, defines the policy. An admission-time sensitivity run reduced TabICL ROC-AUC to 0.874 and recall to 0.469, showing predictive value from first-semester information while retaining the eligibility-timing caveat. Final same-test-set evaluation will report balanced accuracy, macro-F1, ROC-AUC, recall, precision, flag rate, Brier score, calibration, confusion matrices and runtime. Marginal complex-model gains will be reported plainly.</w:t>
+        <w:t>A fixed, stratified 70/15/15 train/validation/test split supports identical comparisons. Protocol amendment 1.1 added a native main-effects Explainable Boosting Machine (EBM) before any test access without changing the split, seed, features or operating policy. Validation-only ROC-AUC was 0.952 for frozen TabICL 2.2.0 (four estimators), 0.946 for EBM, 0.945 for logistic regression and XGBoost, and 0.923 for a depth-3 tree: a modest complex-model gain, not superiority. EBM uses raw named variables with explicit nominal types and no interactions, rather than the one-hot/scaled baseline pipeline. The policy ranks each cohort by risk and flags at most the top 20%, with stable row-order tie-breaking. TabICL then achieved 0.507 dropout recall, 1.000 precision and a 0.199 flag rate; capacity defines the policy. At admission time, EBM marginally led ROC-AUC (0.8753), followed by XGBoost (0.8752) and TabICL (0.8739), showing that the preferred model may depend on timing. Final same-test-set evaluation will report balanced accuracy, macro-F1, ROC-AUC, recall, precision, flag rate, Brier score, calibration, confusion matrices and runtime, with complexity justified only by observed evidence.</w:t>
       </w:r>
     </w:p>
     <w:p>
@@ -740,7 +740,7 @@
               <w:br/>
               <w:t>train-only preparation</w:t>
               <w:br/>
-              <w:t>TabICL + three baselines</w:t>
+              <w:t>TabICL + four baselines</w:t>
             </w:r>
           </w:p>
         </w:tc>
@@ -1442,7 +1442,7 @@
         <w:rPr>
           <w:rtl w:val="0"/>
         </w:rPr>
-        <w:t>The main model is a tabular foundation model combining learned representations with in-context information from a reference set. It fails simulatability and decomposability: its reasoning cannot be recovered from a coefficient list or a small tree, which motivates the post-hoc protocol in Section 5.2. Library and version, reference-set size, feature count, inference configuration, runtime and hardware will be reported. Logistic regression and the depth-3 tree remain simulatable comparisons, and complexity counts as valuable only if supported by same-test-set performance or explanation-study insights.</w:t>
+        <w:t>TabICL combines learned representations with in-context information from a reference set and fails simulatability and decomposability: its reasoning cannot be recovered from a coefficient list or small tree, motivating Section 5.2's post-hoc protocol. By contrast, the main-effects EBM is intrinsically interpretable: each prediction is exactly the logistic transform of an intercept plus one learned shape-function contribution per feature. Its validation probabilities reconstruct from those terms within 3.4e-16, and global term strengths plus fixed low-, median- and high-risk local decompositions are exported. Logistic regression and the depth-3 tree provide further simulatable comparisons. TabICL's validation ROC-AUC exceeds EBM by only 0.006, so the project does not presume that complexity is operationally justified; final same-test-set performance, calibration, runtime and explanation evidence will determine whether TabICL remains a research comparison or EBM is the more defensible deployment candidate.</w:t>
       </w:r>
     </w:p>
     <w:p>
@@ -1475,7 +1475,7 @@
         <w:rPr>
           <w:rtl w:val="0"/>
         </w:rPr>
-        <w:t>The repository separates untouched source data, EDA, modelling code, explanation evaluation, study materials, tables and figures. A pinned core environment and validation commands support a fresh repository clone. Seed 42 and source-row identifiers define the split; the frozen protocol, 18 in-scope tests, capacity metrics, TabICL/SHAP integration check, grouped importance, ALE and subgroup audits are implemented. Before final submission, one command will regenerate all report artefacts and a separate command will launch the prototype from frozen artefacts. The model card will record intended use, data, final metrics, explanation evidence, subgroup results and limitations.</w:t>
+        <w:t>The repository separates untouched source data, EDA, modelling code, explanation evaluation, study materials, tables and figures. A pinned core environment and validation commands support a fresh clone. Seed 42 and source-row identifiers define the split; protocol 1.1, 19 in-scope tests, four baselines, capacity metrics, exact EBM decomposition, the TabICL/SHAP integration check, grouped importance, ALE and subgroup audits are implemented. Before final submission, one command will regenerate all report artefacts and a separate command will launch the prototype from frozen artefacts. The model card will record intended use, data, final metrics, explanation evidence, subgroup results and limitations.</w:t>
       </w:r>
     </w:p>
     <w:p>
@@ -1519,7 +1519,7 @@
         <w:rPr>
           <w:rtl w:val="0"/>
         </w:rPr>
-        <w:t>The proposed contribution extends beyond an accuracy-focused application of the UCI dataset, assessing whether a tabular foundation model's local explanations merit trust in an early-warning setting. Same-test-set baselines, deletion faithfulness, repeated-run and perturbation stability, human forward simulation, qualitative response evidence and feasibility-constrained counterfactuals form a coherent evaluation framework. Limitations include the single-institution UCI context, exclusion of unresolved Enrolled outcomes, approximate model-agnostic attribution, non-causal observational data, a small convenience sample, and likely non-professional participants as target-audience proxies; therefore, the AIT study will test explanation comprehensibility rather than validate predictive performance or deployment suitability at AIT. If explanation runtime requires a smaller background or evaluation budget, that will be fixed on validation data; if recruitment reaches only the minimum planned sample, the study stays descriptive. Findings remain valuable even if TabICL underperforms a simple baseline, explanations prove unstable or unfaithful, participants gain no benefit, or feasible recourse is unavailable.</w:t>
+        <w:t>The proposed contribution extends beyond accuracy, asking whether TabICL's post-hoc local explanations merit trust and whether an intrinsically interpretable EBM offers a more defensible alternative. Same-test-set baselines, deletion faithfulness, white-box recovery, repeated-run and perturbation stability, human forward simulation, qualitative evidence and feasibility-constrained counterfactuals form a coherent evaluation. Limitations include the single-institution UCI context, exclusion of unresolved Enrolled outcomes, approximate model-agnostic attribution, non-causal observational data, a small convenience sample, and likely non-professional audience proxies; therefore, the AIT study tests comprehensibility, not predictive validity or deployment suitability at AIT. If recruitment reaches only the minimum sample, the study stays descriptive. Findings remain valuable if EBM matches or exceeds TabICL, explanations are unstable or unfaithful, participants gain no benefit, or feasible recourse is unavailable.</w:t>
       </w:r>
     </w:p>
     <w:p>
@@ -1533,6 +1533,7 @@
     <w:p>
       <w:pPr>
         <w:pStyle w:val="Heading1"/>
+        <w:pageBreakBefore/>
         <w:spacing w:after="80" w:before="240" w:lineRule="auto"/>
         <w:rPr/>
       </w:pPr>
@@ -1543,7 +1544,7 @@
           <w:szCs w:val="28"/>
           <w:rtl w:val="0"/>
         </w:rPr>
-        <w:t xml:space="preserve">References</w:t>
+        <w:t>Appendix A. References</w:t>
       </w:r>
       <w:r>
         <w:rPr>
@@ -1568,6 +1569,8 @@
         <w:br/>
         <w:t>Qu, J., Holzmüller, D., Varoquaux, G., &amp; Le Morvan, M. (2025). TabICL: A tabular foundation model for in-context learning on large data. Proceedings of the 42nd International Conference on Machine Learning, PMLR 267, 50817–50847. https://proceedings.mlr.press/v267/qu25d.html</w:t>
         <w:br/>
+        <w:t>Lou, Y., Caruana, R., Gehrke, J., &amp; Hooker, G. (2013). Accurate intelligible models with pairwise interactions. Proceedings of the 19th ACM SIGKDD International Conference on Knowledge Discovery and Data Mining, 623–631. https://doi.org/10.1145/2487575.2487579</w:t>
+        <w:br/>
         <w:t>Lundberg, S. M., &amp; Lee, S.-I. (2017). A unified approach to interpreting model predictions. Advances in Neural Information Processing Systems, 30, 4765–4774. https://proceedings.neurips.cc/paper/2017/hash/8a20a8621978632d76c43dfd28b67767-Abstract.html</w:t>
         <w:br/>
         <w:t>Nauta, M., Trienes, J., Pathak, S., Nguyen, E., Peters, M., Schmitt, Y., Schlötterer, J., van Keulen, M., &amp; Seifert, C. (2023). From anecdotal evidence to quantitative evaluation methods: A systematic review on evaluating explainable AI. ACM Computing Surveys, 55(13s), Article 295. https://doi.org/10.1145/3583558</w:t>
@@ -1581,7 +1584,7 @@
     </w:p>
     <w:sectPr>
       <w:pgSz w:h="15840" w:w="12240" w:orient="portrait"/>
-      <w:pgMar w:bottom="1008" w:top="1008" w:left="1152" w:right="1152" w:header="720" w:footer="720"/>
+      <w:pgMar w:bottom="720" w:top="720" w:left="1080" w:right="1080" w:header="720" w:footer="720"/>
       <w:pgNumType w:start="1"/>
     </w:sectPr>
   </w:body>
@@ -1623,7 +1626,7 @@
   <w:style w:type="paragraph" w:styleId="Normal" w:default="1">
     <w:name w:val="normal"/>
     <w:pPr>
-      <w:spacing w:after="80" w:line="240" w:lineRule="auto"/>
+      <w:spacing w:after="0" w:line="240" w:lineRule="auto"/>
     </w:pPr>
   </w:style>
   <w:style w:type="paragraph" w:styleId="Heading1">

</xml_diff>

<commit_message>
Resolve final methodology audit findings
</commit_message>
<xml_diff>
--- a/XDS_Project_Proposal_Submission_Ready.docx
+++ b/XDS_Project_Proposal_Submission_Ready.docx
@@ -408,7 +408,7 @@
         <w:rPr>
           <w:rtl w:val="0"/>
         </w:rPr>
-        <w:t>A fixed, stratified 70/15/15 train/validation/test split supports identical comparisons. Protocol amendment 1.1 added a native main-effects Explainable Boosting Machine (EBM) before any test access without changing the split, seed, features or operating policy. Validation-only ROC-AUC was 0.952 for frozen TabICL 2.2.0 (four estimators), 0.946 for EBM, 0.945 for logistic regression and XGBoost, and 0.923 for a depth-3 tree: a modest complex-model gain, not superiority. EBM uses raw named variables with explicit nominal types and no interactions, rather than the one-hot/scaled baseline pipeline. The policy ranks each cohort by risk and flags at most the top 20%, with stable row-order tie-breaking. TabICL then achieved 0.507 dropout recall, 1.000 precision and a 0.199 flag rate; capacity defines the policy. At admission time, EBM marginally led ROC-AUC (0.8753), followed by XGBoost (0.8752) and TabICL (0.8739), showing that the preferred model may depend on timing. Final same-test-set evaluation will report balanced accuracy, macro-F1, ROC-AUC, recall, precision, flag rate, Brier score, calibration, confusion matrices and runtime, with complexity justified only by observed evidence.</w:t>
+        <w:t>A fixed, stratified 70/15/15 train/validation/test split supports identical comparisons. Before test access, protocol amendments added a native main-effects Explainable Boosting Machine (EBM) and froze all audit rules without changing the split, seed, target or feature windows. Validation ROC-AUC was 0.952 for TabICL 2.2.0 (four estimators), 0.946 for EBM, 0.945 for logistic regression and XGBoost, and 0.923 for a depth-3 tree: a modest complex-model gain, not superiority. EBM uses raw named variables, explicit nominal types and no interactions. The policy ranks each cohort and flags the top 20% with stable tie-breaking; no universal probability threshold is claimed. Among 213 validation dropouts and 108 available flags, TabICL attained the theoretical maximum 0.507 recall with 1.000 precision. At admission time, EBM (0.8753), XGBoost (0.8752) and TabICL (0.8739) were practically tied. One final same-test-set evaluation will report discrimination, capacity metrics, calibration, runtime and paired 2,000-resample bootstrap intervals for model differences.</w:t>
       </w:r>
     </w:p>
     <w:p>
@@ -441,7 +441,7 @@
         <w:rPr>
           <w:rtl w:val="0"/>
         </w:rPr>
-        <w:t>As a TFM is not a tree ensemble, TreeSHAP exactness will not be claimed. Model-agnostic permutation SHAP (Lundberg &amp; Lee, 2017) explains dropout probability using 25 training-only background rows and 67 evaluations, frozen after validation runtime checks. Related raw and derived first-semester variables are masked as semantic groups; derived rates and indicators are recomputed to avoid internally inconsistent records. Ranked deletion is compared with 50 random orders using cumulative absolute probability change, so faithful protective and risk-increasing contributions are both credited; the primary statistic is the ranked-minus-random area with case-level uncertainty. Similar curves indicate inadequate fidelity, and masking measures reliance rather than intervention. A validation integration check reconstructed TabICL probabilities within 4.1e-8, while a synthetic additive white-box check recovered known attribution ranks with Spearman correlation 1.0. Repeated grouped permutation importance supplies global reliance, and ALE plots for three validation-selected numerical features examine global effects with less off-manifold risk than PDP under correlation.</w:t>
+        <w:t>As a TFM is not a tree ensemble, TreeSHAP exactness will not be claimed. Model-agnostic permutation SHAP (Lundberg &amp; Lee, 2017) explains dropout probability using 25 training-only background rows and 67 evaluations. Signed member attributions are summed within each semantic group, preserving additivity, before groups are ranked by absolute total. Deletion masks those same groups with training references, recomputes derived variables, and compares the cumulative absolute probability change with 50 random group orders; the primary statistic is ranked-minus-random area with case-level uncertainty. Similar curves indicate inadequate fidelity, and masking measures reliance, not intervention. Validation checks reconstructed TabICL probabilities within 4.1e-8 and recovered known white-box attribution ranks with Spearman 1.0. Grouped permutation importance supplies global reliance, while ALE examines three validation-selected numerical effects with less off-manifold risk than PDP under correlation.</w:t>
       </w:r>
     </w:p>
     <w:p>
@@ -474,7 +474,7 @@
         <w:rPr>
           <w:rtl w:val="0"/>
         </w:rPr>
-        <w:t>The stability evaluation uses 20 held-out cases selected in advance across predicted-risk levels. For each case, the model-agnostic explainer runs 10 times, independently varying explainer seed and training-background sample so stochastic and reference-population variation are reported separately. Mean pairwise top-five overlap—the number of shared features divided by five—is primary, with rank correlation secondary. Small valid 1% continuous-feature perturbations provide a third test only where absolute predicted-probability change remains at most 0.01; ranges and categorical validity are preserved. These settings are frozen on validation before test analysis. Persistent instability will be shown in the interface, not concealed through selective reruns (Tiukhova et al., 2024).</w:t>
+        <w:t>The stability evaluation deterministically selects four cases from each of five predicted-risk strata (20 total) without labels. For each case, the explainer runs 10 times, varying seed and training-background sample separately. Mean pairwise top-five overlap—shared features divided by five—is primary, with rank correlation secondary. Continuous perturbations draw Gaussian noise with standard deviation equal to 1% of the feature's training standard deviation, clip to training bounds, recompute dependencies, and qualify only when absolute probability change is at most 0.01. Mean overlap below the validation-frozen 0.80 warning level is displayed, not hidden through selective reruns (Tiukhova et al., 2024).</w:t>
       </w:r>
     </w:p>
     <w:p>
@@ -507,7 +507,7 @@
         <w:rPr>
           <w:rtl w:val="0"/>
         </w:rPr>
-        <w:t>Following established forward-simulation evaluation of explanations (Hase &amp; Bansal, 2020), the human study will recruit a voluntary convenience sample from the AIT community, targeting 8–10 participants where recruitment permits and a minimum of 4–5 split evenly between two groups. A lightweight browser-based interface will present the same 10 pseudonymised, held-out UCI profiles in randomised order and record each participant's prediction, confidence, completion time and written responses. The control view shows the profile alone; the explanation view adds feature contributions without revealing the model's output, probability or threshold before submission. Each participant's accuracy across their 10 cases is the primary unit of analysis; group accuracy and completion time will be compared descriptively, and the facilitator will record two or three representative comments made while participants work, alongside the coded written responses (Section 5.7). Unless student-support professionals are recruited, participants are proxies for the intended user, testing comprehensibility rather than professional effectiveness, and no unsupported claim of statistical significance will be made.</w:t>
+        <w:t>Following forward-simulation evaluation (Hase &amp; Bansal, 2020), the human study targets 8–10 voluntary AIT participants, with a minimum of 4–5 split evenly by seeded assignment. After standardised instructions and one unscored practice case, both groups receive the same label-free panel of five flagged and five unflagged profiles in random order; the explanation group additionally sees feature contributions. Neither group receives the output, probability, capacity boundary or correctness feedback until all 10 responses are locked. The interface records predictions, confidence, time and written responses. Participant-level accuracy is primary; group accuracy and time are compared descriptively, with two or three observed comments and coded responses (Section 5.7). Unless support professionals participate, the study tests proxy-user comprehensibility, not professional effectiveness, and makes no significance claim.</w:t>
       </w:r>
     </w:p>
     <w:p>
@@ -540,7 +540,7 @@
         <w:rPr>
           <w:rtl w:val="0"/>
         </w:rPr>
-        <w:t>Before modelling, features are classified by temporal availability and feasibility. Immutable or historical fields include age at enrolment, nationality, prior qualification, first-semester grades and completed units. Potentially changeable conditions, such as resolving outstanding tuition or debt status, are permitted in a counterfactual only when realistic at the decision point, with institution-controlled support distinguished from student-controlled action. The search identifies the smallest feasible change crossing the decision threshold while enforcing valid ranges and dependencies; cases without feasible recourse are reported explicitly. Consistent with Karimi et al. (2021), these outputs describe model behaviour, not causal promises.</w:t>
+        <w:t>Before modelling, features are classified by temporal availability and feasibility. Age, nationality, prior qualifications and completed first-semester outcomes remain fixed. Potentially resolvable tuition or debt conditions may change only when realistic at the decision point, distinguishing institutional support from student-controlled action. For a flagged case, the search finds the smallest feasible change that moves it outside the cohort's top-20% set after recomputing its rank while all other scores stay fixed; no universal threshold is assumed, and no-recourse cases are explicit. These outputs describe model behaviour, not causal promises (Karimi et al., 2021).</w:t>
       </w:r>
     </w:p>
     <w:p>
@@ -740,7 +740,7 @@
               <w:br/>
               <w:t>train-only preparation</w:t>
               <w:br/>
-              <w:t>TabICL + four baselines</w:t>
+              <w:t>TabICL + LR/tree/XGB/EBM</w:t>
             </w:r>
           </w:p>
         </w:tc>
@@ -968,11 +968,11 @@
                 <w:color w:val="1F4E79"/>
                 <w:sz w:val="14"/>
               </w:rPr>
-              <w:t>5. Final predictive test</w:t>
+              <w:t>5. One-time final test</w:t>
               <w:br/>
               <w:t>performance · calibration</w:t>
               <w:br/>
-              <w:t>runtime · error analysis</w:t>
+              <w:t>paired uncertainty · runtime</w:t>
             </w:r>
           </w:p>
         </w:tc>
@@ -1029,9 +1029,9 @@
               </w:rPr>
               <w:t>4. Validation freeze</w:t>
               <w:br/>
-              <w:t>model · threshold · SHAP budget</w:t>
+              <w:t>model · capacity policy</w:t>
               <w:br/>
-              <w:t>masking/perturbation protocol</w:t>
+              <w:t>SHAP groups/budget</w:t>
             </w:r>
           </w:p>
         </w:tc>
@@ -1202,7 +1202,7 @@
               </w:rPr>
               <w:t>7. Explanation evidence</w:t>
               <w:br/>
-              <w:t>deletion · 10-run overlap</w:t>
+              <w:t>deletion + white-box · stability</w:t>
               <w:br/>
               <w:t>perturbation · recourse</w:t>
             </w:r>
@@ -1261,9 +1261,9 @@
               </w:rPr>
               <w:t>8. Decision-support study</w:t>
               <w:br/>
-              <w:t>subgroups/proxies · web prototype</w:t>
+              <w:t>subgroup/proxy audit · prototype</w:t>
               <w:br/>
-              <w:t>AIT forward simulation + coding</w:t>
+              <w:t>blinded A/B study + coding</w:t>
             </w:r>
           </w:p>
         </w:tc>
@@ -1338,7 +1338,7 @@
           <w:i/>
           <w:sz w:val="16"/>
         </w:rPr>
-        <w:t>Figure 1. Proposed research workflow. Model, threshold and explanation protocols will be frozen on validation data before the final test evaluation. Ethics, data governance and reproducibility apply throughout.</w:t>
+        <w:t>Figure 1. Proposed research workflow. Model, capacity policy and explanation protocols are frozen on validation data before one-time final testing. Ethics, governance and reproducibility apply throughout.</w:t>
       </w:r>
     </w:p>
     <w:p>
@@ -1397,7 +1397,7 @@
         <w:rPr>
           <w:rtl w:val="0"/>
         </w:rPr>
-        <w:t>Protected attributes in the UCI data—gender, nationality, age, international status, displaced status and special needs—will be documented explicitly. For groups with at least 30 records, the frozen operating policy will report flag rate, true- and false-positive rates, precision, mean predicted risk and calibration gap. Cramér's V measures categorical association and the correlation ratio measures continuous-feature association with multi-category protected attributes. These descriptive diagnostics are not proof of fairness.</w:t>
+        <w:t>Protected attributes—gender, nationality, age, international status, displaced status and special needs—are explicit. Every group count is retained; performance metrics are suppressed rather than silently omitted below 30 records, and unavailable comparisons are stated. Eligible groups receive flag rate, true- and false-positive rates, precision, mean risk and calibration gap under the exact capacity labels. All non-protected model features are screened as potential proxies using Cramér's V for categorical features and correlation-ratio eta for continuous features. These diagnostics are descriptive, not proof of fairness.</w:t>
       </w:r>
     </w:p>
     <w:p>
@@ -1475,7 +1475,7 @@
         <w:rPr>
           <w:rtl w:val="0"/>
         </w:rPr>
-        <w:t>The repository separates untouched source data, EDA, modelling code, explanation evaluation, study materials, tables and figures. A pinned core environment and validation commands support a fresh clone. Seed 42 and source-row identifiers define the split; protocol 1.1, 19 in-scope tests, four baselines, capacity metrics, exact EBM decomposition, the TabICL/SHAP integration check, grouped importance, ALE and subgroup audits are implemented. Before final submission, one command will regenerate all report artefacts and a separate command will launch the prototype from frozen artefacts. The model card will record intended use, data, final metrics, explanation evidence, subgroup results and limitations.</w:t>
+        <w:t>The repository separates source data, EDA, modelling, explanation evaluation, study materials and outputs. A pinned environment supports a fresh clone. Seed 42 and source-row IDs define the split; protocol 1.2, 26 in-scope tests, four baselines, capacity-consistent recourse, exact EBM decomposition, TabICL/SHAP integration, grouped importance, ALE, explicit subgroup suppression and proxy tables are implemented. Before final submission, one command will regenerate every report artefact and another will launch the prototype from frozen artefacts. The model card records intended use, data, final metrics, explanation evidence, subgroup results and limitations.</w:t>
       </w:r>
     </w:p>
     <w:p>

</xml_diff>

<commit_message>
Adopt final model-comparison proposal title
</commit_message>
<xml_diff>
--- a/XDS_Project_Proposal_Submission_Ready.docx
+++ b/XDS_Project_Proposal_Submission_Ready.docx
@@ -17,7 +17,7 @@
           <w:szCs w:val="40"/>
           <w:rtl w:val="0"/>
         </w:rPr>
-        <w:t>Catching Students Before They Leave</w:t>
+        <w:t>Trustworthy Explanations for Student Dropout Risk:</w:t>
       </w:r>
       <w:r>
         <w:rPr>
@@ -40,7 +40,7 @@
           <w:szCs w:val="26"/>
           <w:rtl w:val="0"/>
         </w:rPr>
-        <w:t>Faithful, Stable, and Actionable Explanations of a Tabular Foundation Model for First-Semester Academic Risk</w:t>
+        <w:t>Comparing Black-Box and Interpretable Models</w:t>
       </w:r>
       <w:r>
         <w:rPr>

</xml_diff>

<commit_message>
Use future tense throughout proposal
</commit_message>
<xml_diff>
--- a/XDS_Project_Proposal_Submission_Ready.docx
+++ b/XDS_Project_Proposal_Submission_Ready.docx
@@ -182,7 +182,7 @@
         <w:rPr>
           <w:rtl w:val="0"/>
         </w:rPr>
-        <w:t>Early identification of dropout risk can enable timely academic or financial support, but an unreliable explanation can misdirect scarce advising resources or produce unjustified conclusions about a student. This project examines first-year undergraduate dropout risk using structured institutional data and TabICL, a peer-reviewed tabular foundation model (TFM) for in-context learning (Qu et al., 2025). TFMs achieve competitive results on small tabular datasets (Hollmann et al., 2025), but explanation quality is multidimensional and must be evaluated quantitatively and with users, not through anecdotal plots alone (Nauta et al., 2023). The principal contribution is therefore evidence about the reliability and practical value of local explanations. Three questions guide the study: RQ1: does TabICL add predictive value over simpler baselines; RQ2: are its local explanations faithful and stable; RQ3: do they help users anticipate model outputs and identify feasible support actions?</w:t>
+        <w:t>Early identification of dropout risk can enable timely academic or financial support, but an unreliable explanation can misdirect scarce advising resources or produce unjustified conclusions about a student. This project will examine first-year undergraduate dropout risk using structured institutional data and TabICL, a peer-reviewed tabular foundation model (TFM) for in-context learning (Qu et al., 2025). TFMs achieve competitive results on small tabular datasets (Hollmann et al., 2025), but explanation quality is multidimensional and must be evaluated quantitatively and with users, not through anecdotal plots alone (Nauta et al., 2023). The principal contribution will therefore be evidence about the reliability and practical value of local explanations. Three questions will guide the study: RQ1: does TabICL add predictive value over simpler baselines; RQ2: are its local explanations faithful and stable; RQ3: do they help users anticipate model outputs and identify feasible support actions?</w:t>
       </w:r>
       <w:r>
         <w:rPr>
@@ -211,7 +211,7 @@
         <w:rPr>
           <w:rtl w:val="0"/>
         </w:rPr>
-        <w:t>All predictive modelling and explanation evaluation use one openly licensed UCI dataset. Short, consented written responses from the human evaluation form the only unstructured component and remain linked to the study cases. No external review corpus or second modelling dataset is included, keeping the prediction task, explanations and human evidence coherently connected.</w:t>
+        <w:t>All predictive modelling and explanation evaluation will use one openly licensed UCI dataset. Short, consented written responses from the human evaluation will form the only unstructured component and will remain linked to the study cases. No external review corpus or second modelling dataset will be included, keeping the prediction task, explanations and human evidence coherently connected.</w:t>
       </w:r>
       <w:r>
         <w:rPr/>
@@ -252,7 +252,7 @@
         <w:rPr>
           <w:rtl w:val="0"/>
         </w:rPr>
-        <w:t>The explanation is designed for a university student-support officer reviewing currently enrolled first-year students immediately after first-semester results are finalised and before second-semester support decisions. For a student flagged as high risk, the officer decides whether to prioritise that student for an outreach meeting and referral to appropriate academic or financial support. Missing a genuinely at-risk student may prevent timely contact, whereas excessive flagging consumes limited support capacity and can erode trust. The explanation must therefore clarify the model's output without presenting associations as causal diagnoses or recommendations.</w:t>
+        <w:t>The explanation will be designed for a university student-support officer reviewing currently enrolled first-year students immediately after first-semester results are finalised and before second-semester support decisions. For a student flagged as high risk, the officer will decide whether to prioritise that student for an outreach meeting and referral to appropriate academic or financial support. Missing a genuinely at-risk student may prevent timely contact, whereas excessive flagging consumes limited support capacity and can erode trust. The explanation must therefore clarify the model's output without presenting associations as causal diagnoses or recommendations.</w:t>
       </w:r>
     </w:p>
     <w:p>
@@ -297,7 +297,7 @@
         <w:rPr>
           <w:rtl w:val="0"/>
         </w:rPr>
-        <w:t>Prospective qualitative data. A voluntary convenience sample from the Asian Institute of Technology (AIT) community will provide brief written rationales, suggested support actions and comments on missing information while evaluating pseudonymised UCI cases. These consented, anonymised responses form the project's only unstructured dataset, remain linked only to study case IDs, and are analysed qualitatively for comprehension, actionability and information gaps. No AIT student records will be collected, and responses will not enter the dropout model or be presented as explanations of real outcomes.</w:t>
+        <w:t>Prospective qualitative data. A voluntary convenience sample from the Asian Institute of Technology (AIT) community will provide brief written rationales, suggested support actions and comments on missing information while evaluating pseudonymised UCI cases. These consented, anonymised responses will form the project's only unstructured dataset, will remain linked only to study case IDs, and will be analysed qualitatively for comprehension, actionability and information gaps. No AIT student records will be collected, and responses will not enter the dropout model or be presented as explanations of real outcomes.</w:t>
       </w:r>
       <w:r>
         <w:rPr>
@@ -342,7 +342,7 @@
         <w:rPr>
           <w:rtl w:val="0"/>
         </w:rPr>
-        <w:t>The primary prediction task is binary: Dropout (1) versus Graduate (0). Enrolled records are excluded as unresolved outcomes rather than confirmed non-dropout cases; this simplifies interpretation but may introduce selection bias and limit applicability to similar unresolved students. A meaningful share of Dropout records (17.3%, versus 3.4% of Graduate records) show no first-semester evaluations, so some labelled dropouts may have left before the decision point rather than after it; this timing ambiguity will be reported as an explicit eligibility limitation. The resulting class distribution will be documented. Subject to time and class support, sensitivity analysis will retain Enrolled as a separate class or group it with non-dropout, while primary conclusions stay tied to the pre-specified binary task.</w:t>
+        <w:t>The primary prediction task will be binary: Dropout (1) versus Graduate (0). Enrolled records will be excluded as unresolved outcomes rather than confirmed non-dropout cases; this will simplify interpretation but may introduce selection bias and limit applicability to similar unresolved students. A meaningful share of Dropout records (17.3%, versus 3.4% of Graduate records) show no first-semester evaluations, so some labelled dropouts may have left before the decision point rather than after it; this timing ambiguity will be reported as an explicit eligibility limitation. The resulting class distribution will be documented. Subject to time and class support, sensitivity analysis will retain Enrolled as a separate class or group it with non-dropout, while primary conclusions will stay tied to the pre-specified binary task.</w:t>
       </w:r>
     </w:p>
     <w:p>
@@ -354,7 +354,7 @@
         <w:rPr>
           <w:rtl w:val="0"/>
         </w:rPr>
-        <w:t>The prediction time is immediately after first-semester results. Only variables available by then may enter the model: enrolment/admission records, demographic and socio-economic fields, administrative status, macroeconomic indicators, and first-semester outcomes. Second-semester curricular variables are excluded as temporal leakage. First-semester grades and approved units are predictive but already historical, so they are treated as immutable in counterfactual recourse.</w:t>
+        <w:t>The prediction time will be immediately after first-semester results. Only variables available by then will enter the model: enrolment/admission records, demographic and socio-economic fields, administrative status, macroeconomic indicators, and first-semester outcomes. Second-semester curricular variables will be excluded as temporal leakage. First-semester grades and approved units are predictive but already historical, so they will be treated as immutable in counterfactual recourse.</w:t>
       </w:r>
     </w:p>
     <w:p>
@@ -441,7 +441,7 @@
         <w:rPr>
           <w:rtl w:val="0"/>
         </w:rPr>
-        <w:t>As a TFM is not a tree ensemble, TreeSHAP exactness will not be claimed. Model-agnostic permutation SHAP (Lundberg &amp; Lee, 2017) explains dropout probability using 25 training-only background rows and 67 evaluations. Signed member attributions are summed within each semantic group, preserving additivity, before groups are ranked by absolute total. Deletion masks those same groups with training references, recomputes derived variables, and compares the cumulative absolute probability change with 50 random group orders; the primary statistic is ranked-minus-random area with case-level uncertainty. Similar curves indicate inadequate fidelity, and masking measures reliance, not intervention. Validation checks reconstructed TabICL probabilities within 4.1e-8 and recovered known white-box attribution ranks with Spearman 1.0. Grouped permutation importance supplies global reliance, while ALE examines three validation-selected numerical effects with less off-manifold risk than PDP under correlation.</w:t>
+        <w:t>As a TFM is not a tree ensemble, TreeSHAP exactness will not be claimed. Model-agnostic permutation SHAP (Lundberg &amp; Lee, 2017) will explain dropout probability using 25 training-only background rows and 67 evaluations. Signed member attributions will be summed within each semantic group, preserving additivity, before groups are ranked by absolute total. Deletion will mask those same groups with training references, recompute derived variables, and compare the cumulative absolute probability change with 50 random group orders; the primary statistic will be ranked-minus-random area with case-level uncertainty. Similar curves will indicate inadequate fidelity, and masking will measure reliance, not intervention. Validation checks reconstructed TabICL probabilities within 4.1e-8 and recovered known white-box attribution ranks with Spearman 1.0. Grouped permutation importance will supply global reliance, while ALE will examine three validation-selected numerical effects with less off-manifold risk than PDP under correlation.</w:t>
       </w:r>
     </w:p>
     <w:p>
@@ -474,7 +474,7 @@
         <w:rPr>
           <w:rtl w:val="0"/>
         </w:rPr>
-        <w:t>The stability evaluation deterministically selects four cases from each of five predicted-risk strata (20 total) without labels. For each case, the explainer runs 10 times, varying seed and training-background sample separately. Mean pairwise top-five overlap—shared features divided by five—is primary, with rank correlation secondary. Continuous perturbations draw Gaussian noise with standard deviation equal to 1% of the feature's training standard deviation, clip to training bounds, recompute dependencies, and qualify only when absolute probability change is at most 0.01. Mean overlap below the validation-frozen 0.80 warning level is displayed, not hidden through selective reruns (Tiukhova et al., 2024).</w:t>
+        <w:t>The stability evaluation will deterministically select four cases from each of five predicted-risk strata (20 total) without labels. For each case, the explainer will run 10 times, varying seed and training-background sample separately. Mean pairwise top-five overlap—shared features divided by five—will be primary, with rank correlation secondary. Continuous perturbations will draw Gaussian noise with standard deviation equal to 1% of the feature's training standard deviation, clip to training bounds, recompute dependencies, and qualify only when absolute probability change is at most 0.01. Mean overlap below the validation-frozen 0.80 warning level will be displayed, not hidden through selective reruns (Tiukhova et al., 2024).</w:t>
       </w:r>
     </w:p>
     <w:p>
@@ -507,7 +507,7 @@
         <w:rPr>
           <w:rtl w:val="0"/>
         </w:rPr>
-        <w:t>Following forward-simulation evaluation (Hase &amp; Bansal, 2020), the human study targets 8–10 voluntary AIT participants, with a minimum of 4–5 split evenly by seeded assignment. After standardised instructions and one unscored practice case, both groups receive the same label-free panel of five flagged and five unflagged profiles in random order; the explanation group additionally sees feature contributions. Neither group receives the output, probability, capacity boundary or correctness feedback until all 10 responses are locked. The interface records predictions, confidence, time and written responses. Participant-level accuracy is primary; group accuracy and time are compared descriptively, with two or three observed comments and coded responses (Section 5.7). Unless support professionals participate, the study tests proxy-user comprehensibility, not professional effectiveness, and makes no significance claim.</w:t>
+        <w:t>Following forward-simulation evaluation (Hase &amp; Bansal, 2020), the human study will target 8–10 voluntary AIT participants, with a minimum of 4–5 split evenly by seeded assignment. After standardised instructions and one unscored practice case, both groups will receive the same label-free panel of five flagged and five unflagged profiles in random order; the explanation group will additionally see feature contributions. Neither group will receive the output, probability, capacity boundary or correctness feedback until all 10 responses are locked. The interface will record predictions, confidence, time and written responses. Participant-level accuracy will be primary; group accuracy and time will be compared descriptively, with two or three observed comments and coded responses (Section 5.7). Unless support professionals participate, the study will test proxy-user comprehensibility, not professional effectiveness, and will make no significance claim.</w:t>
       </w:r>
     </w:p>
     <w:p>
@@ -540,7 +540,7 @@
         <w:rPr>
           <w:rtl w:val="0"/>
         </w:rPr>
-        <w:t>Before modelling, features are classified by temporal availability and feasibility. Age, nationality, prior qualifications and completed first-semester outcomes remain fixed. Potentially resolvable tuition or debt conditions may change only when realistic at the decision point, distinguishing institutional support from student-controlled action. For a flagged case, the search finds the smallest feasible change that moves it outside the cohort's top-20% set after recomputing its rank while all other scores stay fixed; no universal threshold is assumed, and no-recourse cases are explicit. These outputs describe model behaviour, not causal promises (Karimi et al., 2021).</w:t>
+        <w:t>Before modelling, features will be classified by temporal availability and feasibility. Age, nationality, prior qualifications and completed first-semester outcomes will remain fixed. Potentially resolvable tuition or debt conditions may change only when realistic at the decision point, distinguishing institutional support from student-controlled action. For a flagged case, the search will find the smallest feasible change that moves it outside the cohort's top-20% set after recomputing its rank while all other scores stay fixed; no universal threshold will be assumed, and no-recourse cases will be explicit. These outputs will describe model behaviour, not causal promises (Karimi et al., 2021).</w:t>
       </w:r>
     </w:p>
     <w:p>
@@ -573,7 +573,7 @@
         <w:rPr>
           <w:rtl w:val="0"/>
         </w:rPr>
-        <w:t>The end-to-end workflow produces a frozen comparison of TabICL and its baselines, quantitative explanation evidence, constrained counterfactuals, subgroup diagnostics, human-evaluation findings, a completed model card and reproducible report artefacts. A lightweight browser-based prototype provides two controlled modes: a decision-support demonstration showing the frozen prediction, local explanation, reliability warnings and feasible support options, and a blinded study view that suppresses the answer until the participant responds, loading the same versioned preprocessing and model artefacts used in evaluation as a research demonstration, not a production AIT service.</w:t>
+        <w:t>The end-to-end workflow will produce a frozen comparison of TabICL and its baselines, quantitative explanation evidence, constrained counterfactuals, subgroup diagnostics, human-evaluation findings, a completed model card and reproducible report artefacts. A lightweight browser-based prototype will provide two controlled modes: a decision-support demonstration showing the frozen prediction, local explanation, reliability warnings and feasible support options, and a blinded study view that will suppress the answer until the participant responds. Both modes will load the same versioned preprocessing and model artefacts used in evaluation as a research demonstration, not a production AIT service.</w:t>
       </w:r>
     </w:p>
     <w:tbl>
@@ -1318,11 +1318,11 @@
                 <w:color w:val="1F4E79"/>
                 <w:sz w:val="14"/>
               </w:rPr>
-              <w:t>9. Reporting package</w:t>
+              <w:t>9. Final deliverables</w:t>
               <w:br/>
-              <w:t>model card · limitations</w:t>
+              <w:t>report · model card · limitations</w:t>
               <w:br/>
-              <w:t>reproducible report + prototype</w:t>
+              <w:t>code + tables + prototype</w:t>
             </w:r>
           </w:p>
         </w:tc>
@@ -1338,7 +1338,7 @@
           <w:i/>
           <w:sz w:val="16"/>
         </w:rPr>
-        <w:t>Figure 1. Proposed research workflow. Model, capacity policy and explanation protocols are frozen on validation data before one-time final testing. Ethics, governance and reproducibility apply throughout.</w:t>
+        <w:t>Figure 1. Proposed research workflow. Model, capacity policy and explanation protocols will be frozen on validation data before one-time final testing. Ethics, governance and reproducibility will apply throughout.</w:t>
       </w:r>
     </w:p>
     <w:p>
@@ -1352,7 +1352,7 @@
     <w:p>
       <w:pPr/>
       <w:r>
-        <w:t>After the prediction task, each participant explains the judgement, proposes a support action, and flags missing information. A pre-defined coding guide groups responses into comprehension, actionability and information-gap categories; two reviewers independently code at least 20% of responses to report raw agreement, then resolve disagreements and report aggregate counts with paraphrased examples. This qualitative analysis complements the forward-simulation results but does not train, validate or explain the dropout model.</w:t>
+        <w:t>After the prediction task, each participant will explain the judgement, propose a support action, and flag missing information. A pre-defined coding guide will group responses into comprehension, actionability and information-gap categories; two reviewers will independently code at least 20% of responses to report raw agreement, then resolve disagreements and report aggregate counts with paraphrased examples. This qualitative analysis will complement the forward-simulation results but will not train, validate or explain the dropout model.</w:t>
       </w:r>
     </w:p>
     <w:p>
@@ -1385,7 +1385,7 @@
         <w:rPr>
           <w:rtl w:val="0"/>
         </w:rPr>
-        <w:t>The UCI dataset is publicly available under CC BY 4.0 with no direct identifiers; its citation and licence will be preserved, the raw file unchanged, and all transformations documented. AIT human-study participation will be voluntary, informed-consent based, and penalty-free to decline or withdraw. No names, AIT identifiers or administrative records will be collected; raw free text stays outside version control, accidental identifiers are removed, and only aggregate or paraphrased findings are reported. Before recruitment, the team will confirm with the course instructor whether institutional approval is required, obtaining it where applicable.</w:t>
+        <w:t>The UCI dataset is publicly available under CC BY 4.0 with no direct identifiers; its citation and licence will be preserved, the raw file will remain unchanged, and all transformations will be documented. AIT human-study participation will be voluntary, informed-consent based, and penalty-free to decline or withdraw. No names, AIT identifiers or administrative records will be collected; raw free text will stay outside version control, accidental identifiers will be removed, and only aggregate or paraphrased findings will be reported. Before recruitment, the team will confirm with the course instructor whether institutional approval is required, obtaining it where applicable.</w:t>
       </w:r>
     </w:p>
     <w:p>
@@ -1397,7 +1397,7 @@
         <w:rPr>
           <w:rtl w:val="0"/>
         </w:rPr>
-        <w:t>Protected attributes—gender, nationality, age, international status, displaced status and special needs—are explicit. Every group count is retained; performance metrics are suppressed rather than silently omitted below 30 records, and unavailable comparisons are stated. Eligible groups receive flag rate, true- and false-positive rates, precision, mean risk and calibration gap under the exact capacity labels. All non-protected model features are screened as potential proxies using Cramér's V for categorical features and correlation-ratio eta for continuous features. These diagnostics are descriptive, not proof of fairness.</w:t>
+        <w:t>Protected attributes—gender, nationality, age, international status, displaced status and special needs—will be treated as explicit audit attributes. Every group count will be retained; performance metrics will be suppressed rather than silently omitted below 30 records, and unavailable comparisons will be stated. Eligible groups will receive flag rate, true- and false-positive rates, precision, mean risk and calibration gap under the exact capacity labels. All non-protected model features will be screened as potential proxies using Cramér's V for categorical features and correlation-ratio eta for continuous features. These diagnostics will be descriptive, not proof of fairness.</w:t>
       </w:r>
     </w:p>
     <w:p>
@@ -1409,7 +1409,7 @@
         <w:rPr>
           <w:rtl w:val="0"/>
         </w:rPr>
-        <w:t>Plausible proxies will also be examined: parental occupation and qualification may encode socio-economic position, course and application mode may reflect demographic sorting, and debtor, tuition-fee and scholarship variables may encode financial disadvantage. Removing a protected attribute does not eliminate correlated proxy information, so influential proxies and limitations will be documented even where they weaken the model's apparent suitability. The system supports outreach prioritisation, not autonomous denial of education or services.</w:t>
+        <w:t>Plausible proxies will also be examined: parental occupation and qualification may encode socio-economic position, course and application mode may reflect demographic sorting, and debtor, tuition-fee and scholarship variables may encode financial disadvantage. Removing a protected attribute does not eliminate correlated proxy information, so influential proxies and limitations will be documented even where they weaken the model's apparent suitability. The system will support outreach prioritisation, not autonomous denial of education or services.</w:t>
       </w:r>
     </w:p>
     <w:p>
@@ -1475,7 +1475,7 @@
         <w:rPr>
           <w:rtl w:val="0"/>
         </w:rPr>
-        <w:t>The repository separates source data, EDA, modelling, explanation evaluation, study materials and outputs. A pinned environment supports a fresh clone. Seed 42 and source-row IDs define the split; protocol 1.2, 26 in-scope tests, four baselines, capacity-consistent recourse, exact EBM decomposition, TabICL/SHAP integration, grouped importance, ALE, explicit subgroup suppression and proxy tables are implemented. Before final submission, one command will regenerate every report artefact and another will launch the prototype from frozen artefacts. The model card records intended use, data, final metrics, explanation evidence, subgroup results and limitations.</w:t>
+        <w:t>The repository separates source data, EDA, modelling, explanation evaluation, study materials and outputs. A pinned environment supports a fresh clone. Seed 42 and source-row IDs define the split; protocol 1.2, 26 in-scope tests, four baselines, capacity-consistent recourse, exact EBM decomposition, TabICL/SHAP integration, grouped importance, ALE, explicit subgroup suppression and proxy tables are implemented. Before final submission, one command will regenerate every report artefact and another will launch the prototype from frozen artefacts. The completed model card will record intended use, data, final metrics, explanation evidence, subgroup results and limitations.</w:t>
       </w:r>
     </w:p>
     <w:p>
@@ -1519,7 +1519,7 @@
         <w:rPr>
           <w:rtl w:val="0"/>
         </w:rPr>
-        <w:t>The proposed contribution extends beyond accuracy, asking whether TabICL's post-hoc local explanations merit trust and whether an intrinsically interpretable EBM offers a more defensible alternative. Same-test-set baselines, deletion faithfulness, white-box recovery, repeated-run and perturbation stability, human forward simulation, qualitative evidence and feasibility-constrained counterfactuals form a coherent evaluation. Limitations include the single-institution UCI context, exclusion of unresolved Enrolled outcomes, approximate model-agnostic attribution, non-causal observational data, a small convenience sample, and likely non-professional audience proxies; therefore, the AIT study tests comprehensibility, not predictive validity or deployment suitability at AIT. If recruitment reaches only the minimum sample, the study stays descriptive. Findings remain valuable if EBM matches or exceeds TabICL, explanations are unstable or unfaithful, participants gain no benefit, or feasible recourse is unavailable.</w:t>
+        <w:t>The proposed contribution will extend beyond accuracy by asking whether TabICL's post-hoc local explanations merit trust and whether an intrinsically interpretable EBM offers a more defensible alternative. Same-test-set baselines, deletion faithfulness, white-box recovery, repeated-run and perturbation stability, human forward simulation, qualitative evidence and feasibility-constrained counterfactuals will form a coherent evaluation. Expected limitations include the single-institution UCI context, exclusion of unresolved Enrolled outcomes, approximate model-agnostic attribution, non-causal observational data, a small convenience sample, and likely non-professional audience proxies; therefore, the AIT study will test comprehensibility, not predictive validity or deployment suitability at AIT. If recruitment reaches only the minimum sample, the study will remain descriptive. Findings will remain valuable if EBM matches or exceeds TabICL, explanations are unstable or unfaithful, participants gain no benefit, or feasible recourse is unavailable.</w:t>
       </w:r>
     </w:p>
     <w:p>

</xml_diff>

<commit_message>
Add recruitment flexibility and preserve proposal styling
</commit_message>
<xml_diff>
--- a/XDS_Project_Proposal_Submission_Ready.docx
+++ b/XDS_Project_Proposal_Submission_Ready.docx
@@ -5,67 +5,28 @@
     <w:p>
       <w:pPr>
         <w:spacing w:after="40" w:lineRule="auto"/>
-        <w:jc w:val="center"/>
+        <w:jc w:val="both"/>
         <w:rPr/>
       </w:pPr>
       <w:r>
         <w:rPr>
-          <w:b w:val="1"/>
+          <w:rFonts w:ascii="Times New Roman" w:hAnsi="Times New Roman" w:eastAsia="Times New Roman"/>
+          <w:b w:val="0"/>
           <w:bCs w:val="1"/>
+          <w:i w:val="0"/>
           <w:color w:val="2c5f8a"/>
-          <w:sz w:val="40"/>
+          <w:sz w:val="22"/>
           <w:szCs w:val="40"/>
           <w:rtl w:val="0"/>
         </w:rPr>
-        <w:t>Trustworthy Explanations for Student Dropout Risk:</w:t>
+        <w:t>Trustworthy Explanations for Student Dropout Risk: Comparing Black-Box and Interpretable Models</w:t>
       </w:r>
       <w:r>
         <w:rPr>
-          <w:rtl w:val="0"/>
-        </w:rPr>
-      </w:r>
-    </w:p>
-    <w:p>
-      <w:pPr>
-        <w:spacing w:after="200" w:lineRule="auto"/>
-        <w:jc w:val="center"/>
-        <w:rPr/>
-      </w:pPr>
-      <w:r>
-        <w:rPr>
-          <w:i w:val="1"/>
-          <w:iCs w:val="1"/>
-          <w:color w:val="1f2a44"/>
-          <w:sz w:val="26"/>
-          <w:szCs w:val="26"/>
-          <w:rtl w:val="0"/>
-        </w:rPr>
-        <w:t>Comparing Black-Box and Interpretable Models</w:t>
-      </w:r>
-      <w:r>
-        <w:rPr>
-          <w:rtl w:val="0"/>
-        </w:rPr>
-      </w:r>
-    </w:p>
-    <w:p>
-      <w:pPr>
-        <w:spacing w:after="200" w:lineRule="auto"/>
-        <w:jc w:val="center"/>
-        <w:rPr/>
-      </w:pPr>
-      <w:r>
-        <w:rPr>
-          <w:color w:val="555555"/>
-          <w:sz w:val="21"/>
-          <w:szCs w:val="21"/>
-          <w:rtl w:val="0"/>
-        </w:rPr>
-        <w:t xml:space="preserve">XDS — Explainable Data Science  |  Group Project Proposal</w:t>
-        <w:br w:type="textWrapping"/>
-      </w:r>
-      <w:r>
-        <w:rPr>
+          <w:rFonts w:ascii="Times New Roman" w:hAnsi="Times New Roman" w:eastAsia="Times New Roman"/>
+          <w:b w:val="0"/>
+          <w:i w:val="0"/>
+          <w:sz w:val="22"/>
           <w:rtl w:val="0"/>
         </w:rPr>
       </w:r>
@@ -73,95 +34,34 @@
     <w:p>
       <w:pPr>
         <w:spacing w:after="80" w:lineRule="auto"/>
+        <w:jc w:val="both"/>
         <w:rPr/>
       </w:pPr>
       <w:r>
         <w:rPr>
+          <w:rFonts w:ascii="Times New Roman" w:hAnsi="Times New Roman" w:eastAsia="Times New Roman"/>
+          <w:b w:val="0"/>
+          <w:i w:val="0"/>
+          <w:sz w:val="22"/>
           <w:rtl w:val="0"/>
         </w:rPr>
-        <w:t>Group Members</w:t>
-      </w:r>
-    </w:p>
-    <w:p>
-      <w:pPr>
-        <w:spacing w:after="80" w:lineRule="auto"/>
-        <w:rPr/>
-      </w:pPr>
-      <w:r>
-        <w:rPr>
-          <w:rtl w:val="0"/>
-        </w:rPr>
-        <w:t>1) Aye Khin Khin Hpone (Yolanda) — 125970</w:t>
-      </w:r>
-    </w:p>
-    <w:p>
-      <w:pPr>
-        <w:spacing w:after="80" w:lineRule="auto"/>
-        <w:rPr/>
-      </w:pPr>
-      <w:r>
-        <w:rPr>
-          <w:rtl w:val="0"/>
-        </w:rPr>
-        <w:t>2) Nguyen Liem Son (Lucas) — 126729</w:t>
-      </w:r>
-    </w:p>
-    <w:p>
-      <w:pPr>
-        <w:spacing w:after="80" w:lineRule="auto"/>
-        <w:rPr/>
-      </w:pPr>
-      <w:r>
-        <w:rPr>
-          <w:rtl w:val="0"/>
-        </w:rPr>
-        <w:t>3) Witchayda Theppithuk (Noey) — 127419</w:t>
-      </w:r>
-      <w:r>
-        <w:rPr>
-          <w:rtl w:val="0"/>
-        </w:rPr>
-      </w:r>
-      <w:r>
-        <w:rPr>
-          <w:rtl w:val="0"/>
-        </w:rPr>
-      </w:r>
-    </w:p>
-    <w:p>
-      <w:pPr>
-        <w:spacing w:after="80" w:lineRule="auto"/>
-        <w:rPr/>
-      </w:pPr>
-      <w:r>
-        <w:rPr>
-          <w:rtl w:val="0"/>
-        </w:rPr>
-        <w:t>4) Han Htoo Zaw — 127305</w:t>
-      </w:r>
-    </w:p>
-    <w:p>
-      <w:pPr>
-        <w:spacing w:after="80" w:lineRule="auto"/>
-        <w:rPr/>
-      </w:pPr>
-      <w:r>
-        <w:rPr>
-          <w:rtl w:val="0"/>
-        </w:rPr>
-        <w:t>5) Pyae Sone Han — 127366</w:t>
+        <w:t>Aye Khin Khin Hpone (Yolanda) 125970; Nguyen Liem Son (Lucas) 126729; Witchayda Theppithuk (Noey) 127419; Han Htoo Zaw 127305; Pyae Sone Han 127366</w:t>
       </w:r>
     </w:p>
     <w:p>
       <w:pPr>
         <w:pStyle w:val="Heading1"/>
         <w:spacing w:after="80" w:before="240" w:lineRule="auto"/>
+        <w:jc w:val="left"/>
         <w:rPr/>
       </w:pPr>
       <w:r>
         <w:rPr>
+          <w:rFonts w:ascii="Times New Roman" w:hAnsi="Times New Roman" w:eastAsia="Times New Roman"/>
+          <w:b/>
+          <w:i w:val="0"/>
           <w:color w:val="2c5f8a"/>
-          <w:sz w:val="28"/>
+          <w:sz w:val="22"/>
           <w:szCs w:val="28"/>
           <w:rtl w:val="0"/>
         </w:rPr>
@@ -169,6 +69,10 @@
       </w:r>
       <w:r>
         <w:rPr>
+          <w:rFonts w:ascii="Times New Roman" w:hAnsi="Times New Roman" w:eastAsia="Times New Roman"/>
+          <w:b/>
+          <w:i w:val="0"/>
+          <w:sz w:val="22"/>
           <w:rtl w:val="0"/>
         </w:rPr>
       </w:r>
@@ -180,17 +84,29 @@
       </w:pPr>
       <w:r>
         <w:rPr>
+          <w:rFonts w:ascii="Times New Roman" w:hAnsi="Times New Roman" w:eastAsia="Times New Roman"/>
+          <w:b w:val="0"/>
+          <w:i w:val="0"/>
+          <w:sz w:val="22"/>
           <w:rtl w:val="0"/>
         </w:rPr>
         <w:t>Early identification of dropout risk can enable timely academic or financial support, but an unreliable explanation can misdirect scarce advising resources or produce unjustified conclusions about a student. This project will examine first-year undergraduate dropout risk using structured institutional data and TabICL, a peer-reviewed tabular foundation model (TFM) for in-context learning (Qu et al., 2025). TFMs achieve competitive results on small tabular datasets (Hollmann et al., 2025), but explanation quality is multidimensional and must be evaluated quantitatively and with users, not through anecdotal plots alone (Nauta et al., 2023). The principal contribution will therefore be evidence about the reliability and practical value of local explanations. Three questions will guide the study: RQ1: does TabICL add predictive value over simpler baselines; RQ2: are its local explanations faithful and stable; RQ3: do they help users anticipate model outputs and identify feasible support actions?</w:t>
       </w:r>
       <w:r>
         <w:rPr>
+          <w:rFonts w:ascii="Times New Roman" w:hAnsi="Times New Roman" w:eastAsia="Times New Roman"/>
+          <w:b w:val="0"/>
+          <w:i w:val="0"/>
+          <w:sz w:val="22"/>
           <w:rtl w:val="0"/>
         </w:rPr>
       </w:r>
       <w:r>
         <w:rPr>
+          <w:rFonts w:ascii="Times New Roman" w:hAnsi="Times New Roman" w:eastAsia="Times New Roman"/>
+          <w:b w:val="0"/>
+          <w:i w:val="0"/>
+          <w:sz w:val="22"/>
           <w:rtl w:val="0"/>
         </w:rPr>
       </w:r>
@@ -209,15 +125,28 @@
       </w:sdt>
       <w:r>
         <w:rPr>
+          <w:rFonts w:ascii="Times New Roman" w:hAnsi="Times New Roman" w:eastAsia="Times New Roman"/>
+          <w:b w:val="0"/>
+          <w:i w:val="0"/>
+          <w:sz w:val="22"/>
           <w:rtl w:val="0"/>
         </w:rPr>
         <w:t>All predictive modelling and explanation evaluation will use one openly licensed UCI dataset. Short, consented written responses from the human evaluation will form the only unstructured component and will remain linked to the study cases. No external review corpus or second modelling dataset will be included, keeping the prediction task, explanations and human evidence coherently connected.</w:t>
       </w:r>
       <w:r>
-        <w:rPr/>
+        <w:rPr>
+          <w:rFonts w:ascii="Times New Roman" w:hAnsi="Times New Roman" w:eastAsia="Times New Roman"/>
+          <w:b w:val="0"/>
+          <w:i w:val="0"/>
+          <w:sz w:val="22"/>
+        </w:rPr>
       </w:r>
       <w:r>
         <w:rPr>
+          <w:rFonts w:ascii="Times New Roman" w:hAnsi="Times New Roman" w:eastAsia="Times New Roman"/>
+          <w:b w:val="0"/>
+          <w:i w:val="0"/>
+          <w:sz w:val="22"/>
           <w:rtl w:val="0"/>
         </w:rPr>
       </w:r>
@@ -226,12 +155,16 @@
       <w:pPr>
         <w:pStyle w:val="Heading1"/>
         <w:spacing w:after="80" w:before="240" w:lineRule="auto"/>
+        <w:jc w:val="left"/>
         <w:rPr/>
       </w:pPr>
       <w:r>
         <w:rPr>
+          <w:rFonts w:ascii="Times New Roman" w:hAnsi="Times New Roman" w:eastAsia="Times New Roman"/>
+          <w:b/>
+          <w:i w:val="0"/>
           <w:color w:val="2c5f8a"/>
-          <w:sz w:val="28"/>
+          <w:sz w:val="22"/>
           <w:szCs w:val="28"/>
           <w:rtl w:val="0"/>
         </w:rPr>
@@ -239,6 +172,10 @@
       </w:r>
       <w:r>
         <w:rPr>
+          <w:rFonts w:ascii="Times New Roman" w:hAnsi="Times New Roman" w:eastAsia="Times New Roman"/>
+          <w:b/>
+          <w:i w:val="0"/>
+          <w:sz w:val="22"/>
           <w:rtl w:val="0"/>
         </w:rPr>
       </w:r>
@@ -250,6 +187,10 @@
       </w:pPr>
       <w:r>
         <w:rPr>
+          <w:rFonts w:ascii="Times New Roman" w:hAnsi="Times New Roman" w:eastAsia="Times New Roman"/>
+          <w:b w:val="0"/>
+          <w:i w:val="0"/>
+          <w:sz w:val="22"/>
           <w:rtl w:val="0"/>
         </w:rPr>
         <w:t>The explanation will be designed for a university student-support officer reviewing currently enrolled first-year students immediately after first-semester results are finalised and before second-semester support decisions. For a student flagged as high risk, the officer will decide whether to prioritise that student for an outreach meeting and referral to appropriate academic or financial support. Missing a genuinely at-risk student may prevent timely contact, whereas excessive flagging consumes limited support capacity and can erode trust. The explanation must therefore clarify the model's output without presenting associations as causal diagnoses or recommendations.</w:t>
@@ -259,12 +200,16 @@
       <w:pPr>
         <w:pStyle w:val="Heading1"/>
         <w:spacing w:after="80" w:before="240" w:lineRule="auto"/>
+        <w:jc w:val="left"/>
         <w:rPr/>
       </w:pPr>
       <w:r>
         <w:rPr>
+          <w:rFonts w:ascii="Times New Roman" w:hAnsi="Times New Roman" w:eastAsia="Times New Roman"/>
+          <w:b/>
+          <w:i w:val="0"/>
           <w:color w:val="2c5f8a"/>
-          <w:sz w:val="28"/>
+          <w:sz w:val="22"/>
           <w:szCs w:val="28"/>
           <w:rtl w:val="0"/>
         </w:rPr>
@@ -272,6 +217,10 @@
       </w:r>
       <w:r>
         <w:rPr>
+          <w:rFonts w:ascii="Times New Roman" w:hAnsi="Times New Roman" w:eastAsia="Times New Roman"/>
+          <w:b/>
+          <w:i w:val="0"/>
+          <w:sz w:val="22"/>
           <w:rtl w:val="0"/>
         </w:rPr>
       </w:r>
@@ -283,6 +232,10 @@
       </w:pPr>
       <w:r>
         <w:rPr>
+          <w:rFonts w:ascii="Times New Roman" w:hAnsi="Times New Roman" w:eastAsia="Times New Roman"/>
+          <w:b w:val="0"/>
+          <w:i w:val="0"/>
+          <w:sz w:val="22"/>
           <w:rtl w:val="0"/>
         </w:rPr>
         <w:t>Primary modelling data. ‘Predict Students’ Dropout and Academic Success’ (Realinho, Vieira Martins, Machado, &amp; Baptista, 2021), UCI Machine Learning Repository dataset 697, is distributed under CC BY 4.0 and documented in a peer-reviewed data paper (Realinho et al., 2022). It contains 4,424 student records and 36 predictors spanning demographic, socio-economic, admission, administrative, academic and macroeconomic information, with labels Dropout, Enrolled and Graduate. The distributed version has no direct identifiers, and exploratory analysis found no missing values or duplicate rows.</w:t>
@@ -295,19 +248,30 @@
       </w:pPr>
       <w:r>
         <w:rPr>
+          <w:rFonts w:ascii="Times New Roman" w:hAnsi="Times New Roman" w:eastAsia="Times New Roman"/>
+          <w:b w:val="0"/>
+          <w:i w:val="0"/>
+          <w:sz w:val="22"/>
           <w:rtl w:val="0"/>
         </w:rPr>
         <w:t>Prospective qualitative data. A voluntary convenience sample from the Asian Institute of Technology (AIT) community will provide brief written rationales, suggested support actions and comments on missing information while evaluating pseudonymised UCI cases. These consented, anonymised responses will form the project's only unstructured dataset, will remain linked only to study case IDs, and will be analysed qualitatively for comprehension, actionability and information gaps. No AIT student records will be collected, and responses will not enter the dropout model or be presented as explanations of real outcomes.</w:t>
       </w:r>
       <w:r>
         <w:rPr>
-          <w:i w:val="1"/>
+          <w:rFonts w:ascii="Times New Roman" w:hAnsi="Times New Roman" w:eastAsia="Times New Roman"/>
+          <w:b w:val="0"/>
+          <w:i w:val="0"/>
           <w:iCs w:val="1"/>
+          <w:sz w:val="22"/>
           <w:rtl w:val="0"/>
         </w:rPr>
       </w:r>
       <w:r>
         <w:rPr>
+          <w:rFonts w:ascii="Times New Roman" w:hAnsi="Times New Roman" w:eastAsia="Times New Roman"/>
+          <w:b w:val="0"/>
+          <w:i w:val="0"/>
+          <w:sz w:val="22"/>
           <w:rtl w:val="0"/>
         </w:rPr>
       </w:r>
@@ -316,12 +280,16 @@
       <w:pPr>
         <w:pStyle w:val="Heading1"/>
         <w:spacing w:after="80" w:before="240" w:lineRule="auto"/>
+        <w:jc w:val="left"/>
         <w:rPr/>
       </w:pPr>
       <w:r>
         <w:rPr>
+          <w:rFonts w:ascii="Times New Roman" w:hAnsi="Times New Roman" w:eastAsia="Times New Roman"/>
+          <w:b/>
+          <w:i w:val="0"/>
           <w:color w:val="2c5f8a"/>
-          <w:sz w:val="28"/>
+          <w:sz w:val="22"/>
           <w:szCs w:val="28"/>
           <w:rtl w:val="0"/>
         </w:rPr>
@@ -329,6 +297,10 @@
       </w:r>
       <w:r>
         <w:rPr>
+          <w:rFonts w:ascii="Times New Roman" w:hAnsi="Times New Roman" w:eastAsia="Times New Roman"/>
+          <w:b/>
+          <w:i w:val="0"/>
+          <w:sz w:val="22"/>
           <w:rtl w:val="0"/>
         </w:rPr>
       </w:r>
@@ -340,6 +312,10 @@
       </w:pPr>
       <w:r>
         <w:rPr>
+          <w:rFonts w:ascii="Times New Roman" w:hAnsi="Times New Roman" w:eastAsia="Times New Roman"/>
+          <w:b w:val="0"/>
+          <w:i w:val="0"/>
+          <w:sz w:val="22"/>
           <w:rtl w:val="0"/>
         </w:rPr>
         <w:t>The primary prediction task will be binary: Dropout (1) versus Graduate (0). Enrolled records will be excluded as unresolved outcomes rather than confirmed non-dropout cases; this will simplify interpretation but may introduce selection bias and limit applicability to similar unresolved students. A meaningful share of Dropout records (17.3%, versus 3.4% of Graduate records) show no first-semester evaluations, so some labelled dropouts may have left before the decision point rather than after it; this timing ambiguity will be reported as an explicit eligibility limitation. The resulting class distribution will be documented. Subject to time and class support, sensitivity analysis will retain Enrolled as a separate class or group it with non-dropout, while primary conclusions will stay tied to the pre-specified binary task.</w:t>
@@ -352,6 +328,10 @@
       </w:pPr>
       <w:r>
         <w:rPr>
+          <w:rFonts w:ascii="Times New Roman" w:hAnsi="Times New Roman" w:eastAsia="Times New Roman"/>
+          <w:b w:val="0"/>
+          <w:i w:val="0"/>
+          <w:sz w:val="22"/>
           <w:rtl w:val="0"/>
         </w:rPr>
         <w:t>The prediction time will be immediately after first-semester results. Only variables available by then will enter the model: enrolment/admission records, demographic and socio-economic fields, administrative status, macroeconomic indicators, and first-semester outcomes. Second-semester curricular variables will be excluded as temporal leakage. First-semester grades and approved units are predictive but already historical, so they will be treated as immutable in counterfactual recourse.</w:t>
@@ -361,12 +341,16 @@
       <w:pPr>
         <w:pStyle w:val="Heading1"/>
         <w:spacing w:after="80" w:before="240" w:lineRule="auto"/>
+        <w:jc w:val="left"/>
         <w:rPr/>
       </w:pPr>
       <w:r>
         <w:rPr>
+          <w:rFonts w:ascii="Times New Roman" w:hAnsi="Times New Roman" w:eastAsia="Times New Roman"/>
+          <w:b/>
+          <w:i w:val="0"/>
           <w:color w:val="2c5f8a"/>
-          <w:sz w:val="28"/>
+          <w:sz w:val="22"/>
           <w:szCs w:val="28"/>
           <w:rtl w:val="0"/>
         </w:rPr>
@@ -374,6 +358,10 @@
       </w:r>
       <w:r>
         <w:rPr>
+          <w:rFonts w:ascii="Times New Roman" w:hAnsi="Times New Roman" w:eastAsia="Times New Roman"/>
+          <w:b/>
+          <w:i w:val="0"/>
+          <w:sz w:val="22"/>
           <w:rtl w:val="0"/>
         </w:rPr>
       </w:r>
@@ -382,12 +370,16 @@
       <w:pPr>
         <w:pStyle w:val="Heading2"/>
         <w:spacing w:after="40" w:before="160" w:lineRule="auto"/>
+        <w:jc w:val="left"/>
         <w:rPr/>
       </w:pPr>
       <w:r>
         <w:rPr>
+          <w:rFonts w:ascii="Times New Roman" w:hAnsi="Times New Roman" w:eastAsia="Times New Roman"/>
+          <w:b/>
+          <w:i w:val="0"/>
           <w:color w:val="1f2a44"/>
-          <w:sz w:val="24"/>
+          <w:sz w:val="22"/>
           <w:szCs w:val="24"/>
           <w:rtl w:val="0"/>
         </w:rPr>
@@ -395,6 +387,10 @@
       </w:r>
       <w:r>
         <w:rPr>
+          <w:rFonts w:ascii="Times New Roman" w:hAnsi="Times New Roman" w:eastAsia="Times New Roman"/>
+          <w:b/>
+          <w:i w:val="0"/>
+          <w:sz w:val="22"/>
           <w:rtl w:val="0"/>
         </w:rPr>
       </w:r>
@@ -406,6 +402,10 @@
       </w:pPr>
       <w:r>
         <w:rPr>
+          <w:rFonts w:ascii="Times New Roman" w:hAnsi="Times New Roman" w:eastAsia="Times New Roman"/>
+          <w:b w:val="0"/>
+          <w:i w:val="0"/>
+          <w:sz w:val="22"/>
           <w:rtl w:val="0"/>
         </w:rPr>
         <w:t>A fixed, stratified 70/15/15 train/validation/test split supports identical comparisons. Before test access, protocol amendments added a native main-effects Explainable Boosting Machine (EBM) and froze all audit rules without changing the split, seed, target or feature windows. Validation ROC-AUC was 0.952 for TabICL 2.2.0 (four estimators), 0.946 for EBM, 0.945 for logistic regression and XGBoost, and 0.923 for a depth-3 tree: a modest complex-model gain, not superiority. EBM uses raw named variables, explicit nominal types and no interactions. The policy ranks each cohort and flags the top 20% with stable tie-breaking; no universal probability threshold is claimed. Among 213 validation dropouts and 108 available flags, TabICL attained the theoretical maximum 0.507 recall with 1.000 precision. At admission time, EBM (0.8753), XGBoost (0.8752) and TabICL (0.8739) were practically tied. One final same-test-set evaluation will report discrimination, capacity metrics, calibration, runtime and paired 2,000-resample bootstrap intervals for model differences.</w:t>
@@ -415,12 +415,16 @@
       <w:pPr>
         <w:pStyle w:val="Heading2"/>
         <w:spacing w:after="40" w:before="160" w:lineRule="auto"/>
+        <w:jc w:val="left"/>
         <w:rPr/>
       </w:pPr>
       <w:r>
         <w:rPr>
+          <w:rFonts w:ascii="Times New Roman" w:hAnsi="Times New Roman" w:eastAsia="Times New Roman"/>
+          <w:b/>
+          <w:i w:val="0"/>
           <w:color w:val="1f2a44"/>
-          <w:sz w:val="24"/>
+          <w:sz w:val="22"/>
           <w:szCs w:val="24"/>
           <w:rtl w:val="0"/>
         </w:rPr>
@@ -428,6 +432,10 @@
       </w:r>
       <w:r>
         <w:rPr>
+          <w:rFonts w:ascii="Times New Roman" w:hAnsi="Times New Roman" w:eastAsia="Times New Roman"/>
+          <w:b/>
+          <w:i w:val="0"/>
+          <w:sz w:val="22"/>
           <w:rtl w:val="0"/>
         </w:rPr>
       </w:r>
@@ -439,6 +447,10 @@
       </w:pPr>
       <w:r>
         <w:rPr>
+          <w:rFonts w:ascii="Times New Roman" w:hAnsi="Times New Roman" w:eastAsia="Times New Roman"/>
+          <w:b w:val="0"/>
+          <w:i w:val="0"/>
+          <w:sz w:val="22"/>
           <w:rtl w:val="0"/>
         </w:rPr>
         <w:t>As a TFM is not a tree ensemble, TreeSHAP exactness will not be claimed. Model-agnostic permutation SHAP (Lundberg &amp; Lee, 2017) will explain dropout probability using 25 training-only background rows and 67 evaluations. Signed member attributions will be summed within each semantic group, preserving additivity, before groups are ranked by absolute total. Deletion will mask those same groups with training references, recompute derived variables, and compare the cumulative absolute probability change with 50 random group orders; the primary statistic will be ranked-minus-random area with case-level uncertainty. Similar curves will indicate inadequate fidelity, and masking will measure reliance, not intervention. Validation checks reconstructed TabICL probabilities within 4.1e-8 and recovered known white-box attribution ranks with Spearman 1.0. Grouped permutation importance will supply global reliance, while ALE will examine three validation-selected numerical effects with less off-manifold risk than PDP under correlation.</w:t>
@@ -448,12 +460,16 @@
       <w:pPr>
         <w:pStyle w:val="Heading2"/>
         <w:spacing w:after="40" w:before="160" w:lineRule="auto"/>
+        <w:jc w:val="left"/>
         <w:rPr/>
       </w:pPr>
       <w:r>
         <w:rPr>
+          <w:rFonts w:ascii="Times New Roman" w:hAnsi="Times New Roman" w:eastAsia="Times New Roman"/>
+          <w:b/>
+          <w:i w:val="0"/>
           <w:color w:val="1f2a44"/>
-          <w:sz w:val="24"/>
+          <w:sz w:val="22"/>
           <w:szCs w:val="24"/>
           <w:rtl w:val="0"/>
         </w:rPr>
@@ -461,6 +477,10 @@
       </w:r>
       <w:r>
         <w:rPr>
+          <w:rFonts w:ascii="Times New Roman" w:hAnsi="Times New Roman" w:eastAsia="Times New Roman"/>
+          <w:b/>
+          <w:i w:val="0"/>
+          <w:sz w:val="22"/>
           <w:rtl w:val="0"/>
         </w:rPr>
       </w:r>
@@ -472,6 +492,10 @@
       </w:pPr>
       <w:r>
         <w:rPr>
+          <w:rFonts w:ascii="Times New Roman" w:hAnsi="Times New Roman" w:eastAsia="Times New Roman"/>
+          <w:b w:val="0"/>
+          <w:i w:val="0"/>
+          <w:sz w:val="22"/>
           <w:rtl w:val="0"/>
         </w:rPr>
         <w:t>The stability evaluation will deterministically select four cases from each of five predicted-risk strata (20 total) without labels. For each case, the explainer will run 10 times, varying seed and training-background sample separately. Mean pairwise top-five overlap—shared features divided by five—will be primary, with rank correlation secondary. Continuous perturbations will draw Gaussian noise with standard deviation equal to 1% of the feature's training standard deviation, clip to training bounds, recompute dependencies, and qualify only when absolute probability change is at most 0.01. Mean overlap below the validation-frozen 0.80 warning level will be displayed, not hidden through selective reruns (Tiukhova et al., 2024).</w:t>
@@ -481,12 +505,16 @@
       <w:pPr>
         <w:pStyle w:val="Heading2"/>
         <w:spacing w:after="40" w:before="160" w:lineRule="auto"/>
+        <w:jc w:val="left"/>
         <w:rPr/>
       </w:pPr>
       <w:r>
         <w:rPr>
+          <w:rFonts w:ascii="Times New Roman" w:hAnsi="Times New Roman" w:eastAsia="Times New Roman"/>
+          <w:b/>
+          <w:i w:val="0"/>
           <w:color w:val="1f2a44"/>
-          <w:sz w:val="24"/>
+          <w:sz w:val="22"/>
           <w:szCs w:val="24"/>
           <w:rtl w:val="0"/>
         </w:rPr>
@@ -494,6 +522,10 @@
       </w:r>
       <w:r>
         <w:rPr>
+          <w:rFonts w:ascii="Times New Roman" w:hAnsi="Times New Roman" w:eastAsia="Times New Roman"/>
+          <w:b/>
+          <w:i w:val="0"/>
+          <w:sz w:val="22"/>
           <w:rtl w:val="0"/>
         </w:rPr>
       </w:r>
@@ -505,21 +537,29 @@
       </w:pPr>
       <w:r>
         <w:rPr>
+          <w:rFonts w:ascii="Times New Roman" w:hAnsi="Times New Roman" w:eastAsia="Times New Roman"/>
+          <w:b w:val="0"/>
+          <w:i w:val="0"/>
+          <w:sz w:val="22"/>
           <w:rtl w:val="0"/>
         </w:rPr>
-        <w:t>Following forward-simulation evaluation (Hase &amp; Bansal, 2020), the human study will target 8–10 voluntary AIT participants, with a minimum of 4–5 split evenly by seeded assignment. After standardised instructions and one unscored practice case, both groups will receive the same label-free panel of five flagged and five unflagged profiles in random order; the explanation group will additionally see feature contributions. Neither group will receive the output, probability, capacity boundary or correctness feedback until all 10 responses are locked. The interface will record predictions, confidence, time and written responses. Participant-level accuracy will be primary; group accuracy and time will be compared descriptively, with two or three observed comments and coded responses (Section 5.7). Unless support professionals participate, the study will test proxy-user comprehensibility, not professional effectiveness, and will make no significance claim.</w:t>
+        <w:t>Following forward-simulation evaluation (Hase &amp; Bansal, 2020), the human study will aim to recruit 8–10 voluntary AIT participants. At least four participants will be required, and the achieved sample will be allocated as evenly as practicable between groups using seeded assignment. After standardised instructions and one unscored practice case, both groups will receive the same label-free panel of five flagged and five unflagged profiles in random order; the explanation group will additionally see feature contributions. Neither group will receive the output, probability, capacity boundary or correctness feedback until all 10 responses are locked. The interface will record predictions, confidence, time and written responses. Participant-level accuracy will be primary; group accuracy and time will be compared descriptively alongside illustrative paraphrased comments and coded responses (Section 5.7). Recruitment shortfalls and unequal group sizes will be reported transparently. Unless support professionals participate, the study will test proxy-user comprehensibility, not professional effectiveness, and will make no significance claim.</w:t>
       </w:r>
     </w:p>
     <w:p>
       <w:pPr>
         <w:pStyle w:val="Heading2"/>
         <w:spacing w:after="40" w:before="160" w:lineRule="auto"/>
+        <w:jc w:val="left"/>
         <w:rPr/>
       </w:pPr>
       <w:r>
         <w:rPr>
+          <w:rFonts w:ascii="Times New Roman" w:hAnsi="Times New Roman" w:eastAsia="Times New Roman"/>
+          <w:b/>
+          <w:i w:val="0"/>
           <w:color w:val="1f2a44"/>
-          <w:sz w:val="24"/>
+          <w:sz w:val="22"/>
           <w:szCs w:val="24"/>
           <w:rtl w:val="0"/>
         </w:rPr>
@@ -527,6 +567,10 @@
       </w:r>
       <w:r>
         <w:rPr>
+          <w:rFonts w:ascii="Times New Roman" w:hAnsi="Times New Roman" w:eastAsia="Times New Roman"/>
+          <w:b/>
+          <w:i w:val="0"/>
+          <w:sz w:val="22"/>
           <w:rtl w:val="0"/>
         </w:rPr>
       </w:r>
@@ -538,6 +582,10 @@
       </w:pPr>
       <w:r>
         <w:rPr>
+          <w:rFonts w:ascii="Times New Roman" w:hAnsi="Times New Roman" w:eastAsia="Times New Roman"/>
+          <w:b w:val="0"/>
+          <w:i w:val="0"/>
+          <w:sz w:val="22"/>
           <w:rtl w:val="0"/>
         </w:rPr>
         <w:t>Before modelling, features will be classified by temporal availability and feasibility. Age, nationality, prior qualifications and completed first-semester outcomes will remain fixed. Potentially resolvable tuition or debt conditions may change only when realistic at the decision point, distinguishing institutional support from student-controlled action. For a flagged case, the search will find the smallest feasible change that moves it outside the cohort's top-20% set after recomputing its rank while all other scores stay fixed; no universal threshold will be assumed, and no-recourse cases will be explicit. These outputs will describe model behaviour, not causal promises (Karimi et al., 2021).</w:t>
@@ -547,12 +595,16 @@
       <w:pPr>
         <w:pStyle w:val="Heading2"/>
         <w:spacing w:after="40" w:before="160" w:lineRule="auto"/>
+        <w:jc w:val="left"/>
         <w:rPr/>
       </w:pPr>
       <w:r>
         <w:rPr>
+          <w:rFonts w:ascii="Times New Roman" w:hAnsi="Times New Roman" w:eastAsia="Times New Roman"/>
+          <w:b/>
+          <w:i w:val="0"/>
           <w:color w:val="1f2a44"/>
-          <w:sz w:val="24"/>
+          <w:sz w:val="22"/>
           <w:szCs w:val="24"/>
           <w:rtl w:val="0"/>
         </w:rPr>
@@ -560,6 +612,10 @@
       </w:r>
       <w:r>
         <w:rPr>
+          <w:rFonts w:ascii="Times New Roman" w:hAnsi="Times New Roman" w:eastAsia="Times New Roman"/>
+          <w:b/>
+          <w:i w:val="0"/>
+          <w:sz w:val="22"/>
           <w:rtl w:val="0"/>
         </w:rPr>
       </w:r>
@@ -571,9 +627,13 @@
       </w:pPr>
       <w:r>
         <w:rPr>
+          <w:rFonts w:ascii="Times New Roman" w:hAnsi="Times New Roman" w:eastAsia="Times New Roman"/>
+          <w:b w:val="0"/>
+          <w:i w:val="0"/>
+          <w:sz w:val="22"/>
           <w:rtl w:val="0"/>
         </w:rPr>
-        <w:t>The end-to-end workflow will produce a frozen comparison of TabICL and its baselines, quantitative explanation evidence, constrained counterfactuals, subgroup diagnostics, human-evaluation findings, a completed model card and reproducible report artefacts. A lightweight browser-based prototype will provide two controlled modes: a decision-support demonstration showing the frozen prediction, local explanation, reliability warnings and feasible support options, and a blinded study view that will suppress the answer until the participant responds. Both modes will load the same versioned preprocessing and model artefacts used in evaluation as a research demonstration, not a production AIT service.</w:t>
+        <w:t>The end-to-end workflow will produce a frozen comparison of TabICL and its baselines, quantitative explanation evidence, constrained counterfactuals, subgroup diagnostics, human-evaluation findings, a completed model card and reproducible report artefacts. A lightweight browser-based research interface will provide two controlled modes: a decision-support demonstration showing the frozen prediction, local explanation, reliability warnings and feasible support options, and a blinded study view that will suppress the answer until the participant responds. Both modes will load the same versioned preprocessing and model artefacts used in evaluation as a research demonstration, not a production AIT service.</w:t>
       </w:r>
     </w:p>
     <w:tbl>
@@ -614,6 +674,7 @@
             </w:pPr>
             <w:r>
               <w:rPr>
+                <w:rFonts w:ascii="Times New Roman" w:hAnsi="Times New Roman" w:eastAsia="Times New Roman"/>
                 <w:b/>
                 <w:color w:val="1F4E79"/>
                 <w:sz w:val="14"/>
@@ -645,6 +706,7 @@
             </w:pPr>
             <w:r>
               <w:rPr>
+                <w:rFonts w:ascii="Times New Roman" w:hAnsi="Times New Roman" w:eastAsia="Times New Roman"/>
                 <w:b w:val="0"/>
                 <w:color w:val="1F4E79"/>
                 <w:sz w:val="22"/>
@@ -673,6 +735,7 @@
             </w:pPr>
             <w:r>
               <w:rPr>
+                <w:rFonts w:ascii="Times New Roman" w:hAnsi="Times New Roman" w:eastAsia="Times New Roman"/>
                 <w:b/>
                 <w:color w:val="1F4E79"/>
                 <w:sz w:val="14"/>
@@ -704,6 +767,7 @@
             </w:pPr>
             <w:r>
               <w:rPr>
+                <w:rFonts w:ascii="Times New Roman" w:hAnsi="Times New Roman" w:eastAsia="Times New Roman"/>
                 <w:b w:val="0"/>
                 <w:color w:val="1F4E79"/>
                 <w:sz w:val="22"/>
@@ -732,6 +796,7 @@
             </w:pPr>
             <w:r>
               <w:rPr>
+                <w:rFonts w:ascii="Times New Roman" w:hAnsi="Times New Roman" w:eastAsia="Times New Roman"/>
                 <w:b/>
                 <w:color w:val="1F4E79"/>
                 <w:sz w:val="14"/>
@@ -768,6 +833,7 @@
             </w:pPr>
             <w:r>
               <w:rPr>
+                <w:rFonts w:ascii="Times New Roman" w:hAnsi="Times New Roman" w:eastAsia="Times New Roman"/>
                 <w:b w:val="0"/>
                 <w:color w:val="1F4E79"/>
                 <w:sz w:val="22"/>
@@ -794,6 +860,7 @@
             </w:pPr>
             <w:r>
               <w:rPr>
+                <w:rFonts w:ascii="Times New Roman" w:hAnsi="Times New Roman" w:eastAsia="Times New Roman"/>
                 <w:b w:val="0"/>
                 <w:color w:val="1F4E79"/>
                 <w:sz w:val="22"/>
@@ -820,6 +887,7 @@
             </w:pPr>
             <w:r>
               <w:rPr>
+                <w:rFonts w:ascii="Times New Roman" w:hAnsi="Times New Roman" w:eastAsia="Times New Roman"/>
                 <w:b w:val="0"/>
                 <w:color w:val="1F4E79"/>
                 <w:sz w:val="22"/>
@@ -846,6 +914,7 @@
             </w:pPr>
             <w:r>
               <w:rPr>
+                <w:rFonts w:ascii="Times New Roman" w:hAnsi="Times New Roman" w:eastAsia="Times New Roman"/>
                 <w:b w:val="0"/>
                 <w:color w:val="1F4E79"/>
                 <w:sz w:val="22"/>
@@ -872,6 +941,7 @@
             </w:pPr>
             <w:r>
               <w:rPr>
+                <w:rFonts w:ascii="Times New Roman" w:hAnsi="Times New Roman" w:eastAsia="Times New Roman"/>
                 <w:b w:val="0"/>
                 <w:color w:val="1F4E79"/>
                 <w:sz w:val="22"/>
@@ -905,6 +975,7 @@
             </w:pPr>
             <w:r>
               <w:rPr>
+                <w:rFonts w:ascii="Times New Roman" w:hAnsi="Times New Roman" w:eastAsia="Times New Roman"/>
                 <w:b/>
                 <w:color w:val="1F4E79"/>
                 <w:sz w:val="14"/>
@@ -936,6 +1007,7 @@
             </w:pPr>
             <w:r>
               <w:rPr>
+                <w:rFonts w:ascii="Times New Roman" w:hAnsi="Times New Roman" w:eastAsia="Times New Roman"/>
                 <w:b w:val="0"/>
                 <w:color w:val="1F4E79"/>
                 <w:sz w:val="22"/>
@@ -964,6 +1036,7 @@
             </w:pPr>
             <w:r>
               <w:rPr>
+                <w:rFonts w:ascii="Times New Roman" w:hAnsi="Times New Roman" w:eastAsia="Times New Roman"/>
                 <w:b/>
                 <w:color w:val="1F4E79"/>
                 <w:sz w:val="14"/>
@@ -995,6 +1068,7 @@
             </w:pPr>
             <w:r>
               <w:rPr>
+                <w:rFonts w:ascii="Times New Roman" w:hAnsi="Times New Roman" w:eastAsia="Times New Roman"/>
                 <w:b w:val="0"/>
                 <w:color w:val="1F4E79"/>
                 <w:sz w:val="22"/>
@@ -1023,6 +1097,7 @@
             </w:pPr>
             <w:r>
               <w:rPr>
+                <w:rFonts w:ascii="Times New Roman" w:hAnsi="Times New Roman" w:eastAsia="Times New Roman"/>
                 <w:b/>
                 <w:color w:val="1F4E79"/>
                 <w:sz w:val="14"/>
@@ -1059,6 +1134,7 @@
             </w:pPr>
             <w:r>
               <w:rPr>
+                <w:rFonts w:ascii="Times New Roman" w:hAnsi="Times New Roman" w:eastAsia="Times New Roman"/>
                 <w:b w:val="0"/>
                 <w:color w:val="1F4E79"/>
                 <w:sz w:val="22"/>
@@ -1086,6 +1162,7 @@
             </w:pPr>
             <w:r>
               <w:rPr>
+                <w:rFonts w:ascii="Times New Roman" w:hAnsi="Times New Roman" w:eastAsia="Times New Roman"/>
                 <w:b w:val="0"/>
                 <w:color w:val="1F4E79"/>
                 <w:sz w:val="22"/>
@@ -1112,6 +1189,7 @@
             </w:pPr>
             <w:r>
               <w:rPr>
+                <w:rFonts w:ascii="Times New Roman" w:hAnsi="Times New Roman" w:eastAsia="Times New Roman"/>
                 <w:b w:val="0"/>
                 <w:color w:val="1F4E79"/>
                 <w:sz w:val="22"/>
@@ -1138,6 +1216,7 @@
             </w:pPr>
             <w:r>
               <w:rPr>
+                <w:rFonts w:ascii="Times New Roman" w:hAnsi="Times New Roman" w:eastAsia="Times New Roman"/>
                 <w:b w:val="0"/>
                 <w:color w:val="1F4E79"/>
                 <w:sz w:val="22"/>
@@ -1164,6 +1243,7 @@
             </w:pPr>
             <w:r>
               <w:rPr>
+                <w:rFonts w:ascii="Times New Roman" w:hAnsi="Times New Roman" w:eastAsia="Times New Roman"/>
                 <w:b w:val="0"/>
                 <w:color w:val="1F4E79"/>
                 <w:sz w:val="22"/>
@@ -1196,6 +1276,7 @@
             </w:pPr>
             <w:r>
               <w:rPr>
+                <w:rFonts w:ascii="Times New Roman" w:hAnsi="Times New Roman" w:eastAsia="Times New Roman"/>
                 <w:b/>
                 <w:color w:val="1F4E79"/>
                 <w:sz w:val="14"/>
@@ -1227,6 +1308,7 @@
             </w:pPr>
             <w:r>
               <w:rPr>
+                <w:rFonts w:ascii="Times New Roman" w:hAnsi="Times New Roman" w:eastAsia="Times New Roman"/>
                 <w:b w:val="0"/>
                 <w:color w:val="1F4E79"/>
                 <w:sz w:val="22"/>
@@ -1255,13 +1337,14 @@
             </w:pPr>
             <w:r>
               <w:rPr>
+                <w:rFonts w:ascii="Times New Roman" w:hAnsi="Times New Roman" w:eastAsia="Times New Roman"/>
                 <w:b/>
                 <w:color w:val="1F4E79"/>
                 <w:sz w:val="14"/>
               </w:rPr>
               <w:t>8. Decision-support study</w:t>
               <w:br/>
-              <w:t>subgroup/proxy audit · prototype</w:t>
+              <w:t>subgroup/proxy audit · interface</w:t>
               <w:br/>
               <w:t>blinded A/B study + coding</w:t>
             </w:r>
@@ -1286,6 +1369,7 @@
             </w:pPr>
             <w:r>
               <w:rPr>
+                <w:rFonts w:ascii="Times New Roman" w:hAnsi="Times New Roman" w:eastAsia="Times New Roman"/>
                 <w:b w:val="0"/>
                 <w:color w:val="1F4E79"/>
                 <w:sz w:val="22"/>
@@ -1314,6 +1398,7 @@
             </w:pPr>
             <w:r>
               <w:rPr>
+                <w:rFonts w:ascii="Times New Roman" w:hAnsi="Times New Roman" w:eastAsia="Times New Roman"/>
                 <w:b/>
                 <w:color w:val="1F4E79"/>
                 <w:sz w:val="14"/>
@@ -1322,7 +1407,7 @@
               <w:br/>
               <w:t>report · model card · limitations</w:t>
               <w:br/>
-              <w:t>code + tables + prototype</w:t>
+              <w:t>code + tables + interface</w:t>
             </w:r>
           </w:p>
         </w:tc>
@@ -1331,12 +1416,14 @@
     <w:p>
       <w:pPr>
         <w:spacing w:after="120"/>
-        <w:jc w:val="center"/>
+        <w:jc w:val="both"/>
       </w:pPr>
       <w:r>
         <w:rPr>
-          <w:i/>
-          <w:sz w:val="16"/>
+          <w:rFonts w:ascii="Times New Roman" w:hAnsi="Times New Roman" w:eastAsia="Times New Roman"/>
+          <w:b w:val="0"/>
+          <w:i w:val="0"/>
+          <w:sz w:val="22"/>
         </w:rPr>
         <w:t>Figure 1. Proposed research workflow. Model, capacity policy and explanation protocols will be frozen on validation data before one-time final testing. Ethics, governance and reproducibility will apply throughout.</w:t>
       </w:r>
@@ -1344,14 +1431,30 @@
     <w:p>
       <w:pPr>
         <w:pStyle w:val="Heading2"/>
+        <w:spacing w:after="40"/>
+        <w:jc w:val="left"/>
       </w:pPr>
       <w:r>
+        <w:rPr>
+          <w:rFonts w:ascii="Times New Roman" w:hAnsi="Times New Roman" w:eastAsia="Times New Roman"/>
+          <w:b/>
+          <w:i w:val="0"/>
+          <w:sz w:val="22"/>
+        </w:rPr>
         <w:t>5.7  Qualitative Analysis of Human-Study Responses</w:t>
       </w:r>
     </w:p>
     <w:p>
-      <w:pPr/>
+      <w:pPr>
+        <w:jc w:val="both"/>
+      </w:pPr>
       <w:r>
+        <w:rPr>
+          <w:rFonts w:ascii="Times New Roman" w:hAnsi="Times New Roman" w:eastAsia="Times New Roman"/>
+          <w:b w:val="0"/>
+          <w:i w:val="0"/>
+          <w:sz w:val="22"/>
+        </w:rPr>
         <w:t>After the prediction task, each participant will explain the judgement, propose a support action, and flag missing information. A pre-defined coding guide will group responses into comprehension, actionability and information-gap categories; two reviewers will independently code at least 20% of responses to report raw agreement, then resolve disagreements and report aggregate counts with paraphrased examples. This qualitative analysis will complement the forward-simulation results but will not train, validate or explain the dropout model.</w:t>
       </w:r>
     </w:p>
@@ -1359,12 +1462,16 @@
       <w:pPr>
         <w:pStyle w:val="Heading1"/>
         <w:spacing w:after="80" w:before="240" w:lineRule="auto"/>
+        <w:jc w:val="left"/>
         <w:rPr/>
       </w:pPr>
       <w:r>
         <w:rPr>
+          <w:rFonts w:ascii="Times New Roman" w:hAnsi="Times New Roman" w:eastAsia="Times New Roman"/>
+          <w:b/>
+          <w:i w:val="0"/>
           <w:color w:val="2c5f8a"/>
-          <w:sz w:val="28"/>
+          <w:sz w:val="22"/>
           <w:szCs w:val="28"/>
           <w:rtl w:val="0"/>
         </w:rPr>
@@ -1372,6 +1479,10 @@
       </w:r>
       <w:r>
         <w:rPr>
+          <w:rFonts w:ascii="Times New Roman" w:hAnsi="Times New Roman" w:eastAsia="Times New Roman"/>
+          <w:b/>
+          <w:i w:val="0"/>
+          <w:sz w:val="22"/>
           <w:rtl w:val="0"/>
         </w:rPr>
       </w:r>
@@ -1383,6 +1494,10 @@
       </w:pPr>
       <w:r>
         <w:rPr>
+          <w:rFonts w:ascii="Times New Roman" w:hAnsi="Times New Roman" w:eastAsia="Times New Roman"/>
+          <w:b w:val="0"/>
+          <w:i w:val="0"/>
+          <w:sz w:val="22"/>
           <w:rtl w:val="0"/>
         </w:rPr>
         <w:t>The UCI dataset is publicly available under CC BY 4.0 with no direct identifiers; its citation and licence will be preserved, the raw file will remain unchanged, and all transformations will be documented. AIT human-study participation will be voluntary, informed-consent based, and penalty-free to decline or withdraw. No names, AIT identifiers or administrative records will be collected; raw free text will stay outside version control, accidental identifiers will be removed, and only aggregate or paraphrased findings will be reported. Before recruitment, the team will confirm with the course instructor whether institutional approval is required, obtaining it where applicable.</w:t>
@@ -1395,6 +1510,10 @@
       </w:pPr>
       <w:r>
         <w:rPr>
+          <w:rFonts w:ascii="Times New Roman" w:hAnsi="Times New Roman" w:eastAsia="Times New Roman"/>
+          <w:b w:val="0"/>
+          <w:i w:val="0"/>
+          <w:sz w:val="22"/>
           <w:rtl w:val="0"/>
         </w:rPr>
         <w:t>Protected attributes—gender, nationality, age, international status, displaced status and special needs—will be treated as explicit audit attributes. Every group count will be retained; performance metrics will be suppressed rather than silently omitted below 30 records, and unavailable comparisons will be stated. Eligible groups will receive flag rate, true- and false-positive rates, precision, mean risk and calibration gap under the exact capacity labels. All non-protected model features will be screened as potential proxies using Cramér's V for categorical features and correlation-ratio eta for continuous features. These diagnostics will be descriptive, not proof of fairness.</w:t>
@@ -1407,6 +1526,10 @@
       </w:pPr>
       <w:r>
         <w:rPr>
+          <w:rFonts w:ascii="Times New Roman" w:hAnsi="Times New Roman" w:eastAsia="Times New Roman"/>
+          <w:b w:val="0"/>
+          <w:i w:val="0"/>
+          <w:sz w:val="22"/>
           <w:rtl w:val="0"/>
         </w:rPr>
         <w:t>Plausible proxies will also be examined: parental occupation and qualification may encode socio-economic position, course and application mode may reflect demographic sorting, and debtor, tuition-fee and scholarship variables may encode financial disadvantage. Removing a protected attribute does not eliminate correlated proxy information, so influential proxies and limitations will be documented even where they weaken the model's apparent suitability. The system will support outreach prioritisation, not autonomous denial of education or services.</w:t>
@@ -1416,12 +1539,16 @@
       <w:pPr>
         <w:pStyle w:val="Heading1"/>
         <w:spacing w:after="80" w:before="240" w:lineRule="auto"/>
+        <w:jc w:val="left"/>
         <w:rPr/>
       </w:pPr>
       <w:r>
         <w:rPr>
+          <w:rFonts w:ascii="Times New Roman" w:hAnsi="Times New Roman" w:eastAsia="Times New Roman"/>
+          <w:b/>
+          <w:i w:val="0"/>
           <w:color w:val="2c5f8a"/>
-          <w:sz w:val="28"/>
+          <w:sz w:val="22"/>
           <w:szCs w:val="28"/>
           <w:rtl w:val="0"/>
         </w:rPr>
@@ -1429,6 +1556,10 @@
       </w:r>
       <w:r>
         <w:rPr>
+          <w:rFonts w:ascii="Times New Roman" w:hAnsi="Times New Roman" w:eastAsia="Times New Roman"/>
+          <w:b/>
+          <w:i w:val="0"/>
+          <w:sz w:val="22"/>
           <w:rtl w:val="0"/>
         </w:rPr>
       </w:r>
@@ -1440,6 +1571,10 @@
       </w:pPr>
       <w:r>
         <w:rPr>
+          <w:rFonts w:ascii="Times New Roman" w:hAnsi="Times New Roman" w:eastAsia="Times New Roman"/>
+          <w:b w:val="0"/>
+          <w:i w:val="0"/>
+          <w:sz w:val="22"/>
           <w:rtl w:val="0"/>
         </w:rPr>
         <w:t>TabICL combines learned representations with in-context information from a reference set and fails simulatability and decomposability: its reasoning cannot be recovered from a coefficient list or small tree, motivating Section 5.2's post-hoc protocol. By contrast, the main-effects EBM is intrinsically interpretable: each prediction is exactly the logistic transform of an intercept plus one learned shape-function contribution per feature. Its validation probabilities reconstruct from those terms within 3.4e-16, and global term strengths plus fixed low-, median- and high-risk local decompositions are exported. Logistic regression and the depth-3 tree provide further simulatable comparisons. TabICL's validation ROC-AUC exceeds EBM by only 0.006, so the project does not presume that complexity is operationally justified; final same-test-set performance, calibration, runtime and explanation evidence will determine whether TabICL remains a research comparison or EBM is the more defensible deployment candidate.</w:t>
@@ -1449,12 +1584,16 @@
       <w:pPr>
         <w:pStyle w:val="Heading1"/>
         <w:spacing w:after="80" w:before="240" w:lineRule="auto"/>
+        <w:jc w:val="left"/>
         <w:rPr/>
       </w:pPr>
       <w:r>
         <w:rPr>
+          <w:rFonts w:ascii="Times New Roman" w:hAnsi="Times New Roman" w:eastAsia="Times New Roman"/>
+          <w:b/>
+          <w:i w:val="0"/>
           <w:color w:val="2c5f8a"/>
-          <w:sz w:val="28"/>
+          <w:sz w:val="22"/>
           <w:szCs w:val="28"/>
           <w:rtl w:val="0"/>
         </w:rPr>
@@ -1462,6 +1601,10 @@
       </w:r>
       <w:r>
         <w:rPr>
+          <w:rFonts w:ascii="Times New Roman" w:hAnsi="Times New Roman" w:eastAsia="Times New Roman"/>
+          <w:b/>
+          <w:i w:val="0"/>
+          <w:sz w:val="22"/>
           <w:rtl w:val="0"/>
         </w:rPr>
       </w:r>
@@ -1473,18 +1616,27 @@
       </w:pPr>
       <w:r>
         <w:rPr>
+          <w:rFonts w:ascii="Times New Roman" w:hAnsi="Times New Roman" w:eastAsia="Times New Roman"/>
+          <w:b w:val="0"/>
+          <w:i w:val="0"/>
+          <w:sz w:val="22"/>
           <w:rtl w:val="0"/>
         </w:rPr>
-        <w:t>The repository separates source data, EDA, modelling, explanation evaluation, study materials and outputs. A pinned environment supports a fresh clone. Seed 42 and source-row IDs define the split; protocol 1.2, 26 in-scope tests, four baselines, capacity-consistent recourse, exact EBM decomposition, TabICL/SHAP integration, grouped importance, ALE, explicit subgroup suppression and proxy tables are implemented. Before final submission, one command will regenerate every report artefact and another will launch the prototype from frozen artefacts. The completed model card will record intended use, data, final metrics, explanation evidence, subgroup results and limitations.</w:t>
+        <w:t>The repository separates source data, EDA, modelling, explanation evaluation, study materials and outputs. A pinned environment supports a fresh clone. Seed 42 and source-row IDs define the split; protocol 1.2, 26 in-scope tests, four baselines, capacity-consistent recourse, exact EBM decomposition, TabICL/SHAP integration, grouped importance, ALE, explicit subgroup suppression and proxy tables are implemented. Before final submission, one command will regenerate every report artefact and another will launch the interface from frozen artefacts. The completed model card will record intended use, data, final metrics, explanation evidence, subgroup results and limitations.</w:t>
       </w:r>
     </w:p>
     <w:p>
       <w:pPr>
         <w:spacing w:after="40" w:lineRule="auto"/>
+        <w:jc w:val="both"/>
         <w:rPr/>
       </w:pPr>
       <w:r>
         <w:rPr>
+          <w:rFonts w:ascii="Times New Roman" w:hAnsi="Times New Roman" w:eastAsia="Times New Roman"/>
+          <w:b w:val="0"/>
+          <w:i w:val="0"/>
+          <w:sz w:val="22"/>
           <w:rtl w:val="0"/>
         </w:rPr>
       </w:r>
@@ -1493,12 +1645,16 @@
       <w:pPr>
         <w:pStyle w:val="Heading1"/>
         <w:spacing w:after="80" w:before="240" w:lineRule="auto"/>
+        <w:jc w:val="left"/>
         <w:rPr/>
       </w:pPr>
       <w:r>
         <w:rPr>
+          <w:rFonts w:ascii="Times New Roman" w:hAnsi="Times New Roman" w:eastAsia="Times New Roman"/>
+          <w:b/>
+          <w:i w:val="0"/>
           <w:color w:val="2c5f8a"/>
-          <w:sz w:val="28"/>
+          <w:sz w:val="22"/>
           <w:szCs w:val="28"/>
           <w:rtl w:val="0"/>
         </w:rPr>
@@ -1506,6 +1662,10 @@
       </w:r>
       <w:r>
         <w:rPr>
+          <w:rFonts w:ascii="Times New Roman" w:hAnsi="Times New Roman" w:eastAsia="Times New Roman"/>
+          <w:b/>
+          <w:i w:val="0"/>
+          <w:sz w:val="22"/>
           <w:rtl w:val="0"/>
         </w:rPr>
       </w:r>
@@ -1517,15 +1677,25 @@
       </w:pPr>
       <w:r>
         <w:rPr>
+          <w:rFonts w:ascii="Times New Roman" w:hAnsi="Times New Roman" w:eastAsia="Times New Roman"/>
+          <w:b w:val="0"/>
+          <w:i w:val="0"/>
+          <w:sz w:val="22"/>
           <w:rtl w:val="0"/>
         </w:rPr>
         <w:t>The proposed contribution will extend beyond accuracy by asking whether TabICL's post-hoc local explanations merit trust and whether an intrinsically interpretable EBM offers a more defensible alternative. Same-test-set baselines, deletion faithfulness, white-box recovery, repeated-run and perturbation stability, human forward simulation, qualitative evidence and feasibility-constrained counterfactuals will form a coherent evaluation. Expected limitations include the single-institution UCI context, exclusion of unresolved Enrolled outcomes, approximate model-agnostic attribution, non-causal observational data, a small convenience sample, and likely non-professional audience proxies; therefore, the AIT study will test comprehensibility, not predictive validity or deployment suitability at AIT. If recruitment reaches only the minimum sample, the study will remain descriptive. Findings will remain valuable if EBM matches or exceeds TabICL, explanations are unstable or unfaithful, participants gain no benefit, or feasible recourse is unavailable.</w:t>
       </w:r>
     </w:p>
     <w:p>
+      <w:pPr>
+        <w:jc w:val="both"/>
+      </w:pPr>
       <w:r>
         <w:rPr>
-          <w:sz w:val="20"/>
+          <w:rFonts w:ascii="Times New Roman" w:hAnsi="Times New Roman" w:eastAsia="Times New Roman"/>
+          <w:b w:val="0"/>
+          <w:i w:val="0"/>
+          <w:sz w:val="22"/>
         </w:rPr>
         <w:t>Code and data availability. The versioned project repository will be released at https://github.com/TheInterpreters/Proposal_EDA with code, tests, non-sensitive tables and reproduction commands; raw human free text will remain excluded.</w:t>
       </w:r>
@@ -1535,12 +1705,16 @@
         <w:pStyle w:val="Heading1"/>
         <w:pageBreakBefore/>
         <w:spacing w:after="80" w:before="240" w:lineRule="auto"/>
+        <w:jc w:val="left"/>
         <w:rPr/>
       </w:pPr>
       <w:r>
         <w:rPr>
+          <w:rFonts w:ascii="Times New Roman" w:hAnsi="Times New Roman" w:eastAsia="Times New Roman"/>
+          <w:b/>
+          <w:i w:val="0"/>
           <w:color w:val="2c5f8a"/>
-          <w:sz w:val="28"/>
+          <w:sz w:val="22"/>
           <w:szCs w:val="28"/>
           <w:rtl w:val="0"/>
         </w:rPr>
@@ -1548,17 +1722,25 @@
       </w:r>
       <w:r>
         <w:rPr>
+          <w:rFonts w:ascii="Times New Roman" w:hAnsi="Times New Roman" w:eastAsia="Times New Roman"/>
+          <w:b/>
+          <w:i w:val="0"/>
+          <w:sz w:val="22"/>
           <w:rtl w:val="0"/>
         </w:rPr>
       </w:r>
     </w:p>
     <w:p>
       <w:pPr>
-        <w:jc w:val="left"/>
+        <w:jc w:val="both"/>
         <w:rPr/>
       </w:pPr>
       <w:r>
         <w:rPr>
+          <w:rFonts w:ascii="Times New Roman" w:hAnsi="Times New Roman" w:eastAsia="Times New Roman"/>
+          <w:b w:val="0"/>
+          <w:i w:val="0"/>
+          <w:sz w:val="22"/>
           <w:rtl w:val="0"/>
         </w:rPr>
         <w:t>Realinho, V., Vieira Martins, M., Machado, J., &amp; Baptista, L. (2021). Predict Students’ Dropout and Academic Success [Dataset]. UCI Machine Learning Repository. https://doi.org/10.24432/C5MC89</w:t>

</xml_diff>